<commit_message>
Updated documentation and profile page
</commit_message>
<xml_diff>
--- a/src/app/actions/Auth_&_OTP.docx
+++ b/src/app/actions/Auth_&_OTP.docx
@@ -14,36 +14,6 @@
           <w:b/>
           <w:bCs/>
         </w:rPr>
-        <w:t>System Architecture &amp; Security Documentation</w:t>
-      </w:r>
-    </w:p>
-    <w:p>
-      <w:pPr>
-        <w:rPr>
-          <w:b/>
-          <w:bCs/>
-        </w:rPr>
-      </w:pPr>
-      <w:r>
-        <w:rPr>
-          <w:b/>
-          <w:bCs/>
-        </w:rPr>
-        <w:t>System Architecture &amp; Security Documentation:</w:t>
-      </w:r>
-    </w:p>
-    <w:p>
-      <w:pPr>
-        <w:rPr>
-          <w:b/>
-          <w:bCs/>
-        </w:rPr>
-      </w:pPr>
-      <w:r>
-        <w:rPr>
-          <w:b/>
-          <w:bCs/>
-        </w:rPr>
         <w:t>This document provides a comprehensive technical reference for the authentication, access control, and security hardening implementations within the Nexus platform. It details the structural code files, database schemas, and defense mechanisms engineered to protect the application against automated exploitation, data exfiltration, and denial-of-service vectors.</w:t>
       </w:r>
     </w:p>
@@ -66,7 +36,7 @@
       <w:pPr>
         <w:numPr>
           <w:ilvl w:val="0"/>
-          <w:numId w:val="4"/>
+          <w:numId w:val="8"/>
         </w:numPr>
         <w:rPr>
           <w:b/>
@@ -78,14 +48,14 @@
           <w:b/>
           <w:bCs/>
         </w:rPr>
-        <w:t>Framework: Next.js 14+ (App Router, Server Actions)</w:t>
+        <w:t xml:space="preserve">Framework: Next.js 14+ (App Router, Server Actions). </w:t>
       </w:r>
     </w:p>
     <w:p>
       <w:pPr>
         <w:numPr>
           <w:ilvl w:val="0"/>
-          <w:numId w:val="4"/>
+          <w:numId w:val="8"/>
         </w:numPr>
         <w:rPr>
           <w:b/>
@@ -97,30 +67,14 @@
           <w:b/>
           <w:bCs/>
         </w:rPr>
-        <w:t xml:space="preserve">Database &amp; Backend: </w:t>
-      </w:r>
-      <w:proofErr w:type="spellStart"/>
-      <w:r>
-        <w:rPr>
-          <w:b/>
-          <w:bCs/>
-        </w:rPr>
-        <w:t>Supabase</w:t>
-      </w:r>
-      <w:proofErr w:type="spellEnd"/>
-      <w:r>
-        <w:rPr>
-          <w:b/>
-          <w:bCs/>
-        </w:rPr>
-        <w:t xml:space="preserve"> (PostgreSQL)</w:t>
+        <w:t xml:space="preserve">Database &amp; Backend: Supabase (PostgreSQL). </w:t>
       </w:r>
     </w:p>
     <w:p>
       <w:pPr>
         <w:numPr>
           <w:ilvl w:val="0"/>
-          <w:numId w:val="4"/>
+          <w:numId w:val="8"/>
         </w:numPr>
         <w:rPr>
           <w:b/>
@@ -132,46 +86,14 @@
           <w:b/>
           <w:bCs/>
         </w:rPr>
-        <w:t xml:space="preserve">Authentication &amp; Hashing: </w:t>
-      </w:r>
-      <w:proofErr w:type="spellStart"/>
-      <w:r>
-        <w:rPr>
-          <w:b/>
-          <w:bCs/>
-        </w:rPr>
-        <w:t>NextAuth</w:t>
-      </w:r>
-      <w:proofErr w:type="spellEnd"/>
-      <w:r>
-        <w:rPr>
-          <w:b/>
-          <w:bCs/>
-        </w:rPr>
-        <w:t xml:space="preserve"> ecosystem standards, </w:t>
-      </w:r>
-      <w:proofErr w:type="spellStart"/>
-      <w:r>
-        <w:rPr>
-          <w:b/>
-          <w:bCs/>
-        </w:rPr>
-        <w:t>bcrypt</w:t>
-      </w:r>
-      <w:proofErr w:type="spellEnd"/>
-      <w:r>
-        <w:rPr>
-          <w:b/>
-          <w:bCs/>
-        </w:rPr>
-        <w:t xml:space="preserve"> (Salt rounds: 10)</w:t>
+        <w:t xml:space="preserve">Authentication &amp; Hashing: NextAuth ecosystem standards, bcryptjs (Salt rounds: 10). </w:t>
       </w:r>
     </w:p>
     <w:p>
       <w:pPr>
         <w:numPr>
           <w:ilvl w:val="0"/>
-          <w:numId w:val="4"/>
+          <w:numId w:val="8"/>
         </w:numPr>
         <w:rPr>
           <w:b/>
@@ -183,46 +105,14 @@
           <w:b/>
           <w:bCs/>
         </w:rPr>
-        <w:t xml:space="preserve">Rate Limiting &amp; DDoS </w:t>
-      </w:r>
-      <w:proofErr w:type="gramStart"/>
-      <w:r>
-        <w:rPr>
-          <w:b/>
-          <w:bCs/>
-        </w:rPr>
-        <w:t>Shield: @</w:t>
-      </w:r>
-      <w:proofErr w:type="gramEnd"/>
-      <w:r>
-        <w:rPr>
-          <w:b/>
-          <w:bCs/>
-        </w:rPr>
-        <w:t>upstash/</w:t>
-      </w:r>
-      <w:proofErr w:type="gramStart"/>
-      <w:r>
-        <w:rPr>
-          <w:b/>
-          <w:bCs/>
-        </w:rPr>
-        <w:t>ratelimit &amp; @</w:t>
-      </w:r>
-      <w:proofErr w:type="gramEnd"/>
-      <w:r>
-        <w:rPr>
-          <w:b/>
-          <w:bCs/>
-        </w:rPr>
-        <w:t>upstash/redis (Sliding window algorithm)</w:t>
+        <w:t xml:space="preserve">Rate Limiting &amp; DDoS Shield: @upstash/ratelimit &amp; @upstash/redis (Sliding window algorithm). </w:t>
       </w:r>
     </w:p>
     <w:p>
       <w:pPr>
         <w:numPr>
           <w:ilvl w:val="0"/>
-          <w:numId w:val="4"/>
+          <w:numId w:val="8"/>
         </w:numPr>
         <w:rPr>
           <w:b/>
@@ -234,23 +124,7 @@
           <w:b/>
           <w:bCs/>
         </w:rPr>
-        <w:t xml:space="preserve">Email Failover Engine: 4-tier redundancy pipeline (Brevo → Resend → Sender → </w:t>
-      </w:r>
-      <w:proofErr w:type="spellStart"/>
-      <w:r>
-        <w:rPr>
-          <w:b/>
-          <w:bCs/>
-        </w:rPr>
-        <w:t>CloudMailin</w:t>
-      </w:r>
-      <w:proofErr w:type="spellEnd"/>
-      <w:r>
-        <w:rPr>
-          <w:b/>
-          <w:bCs/>
-        </w:rPr>
-        <w:t>)</w:t>
+        <w:t xml:space="preserve">Email Failover Engine: 4-tier redundancy pipeline (Brevo → Resend → Sender → CloudMailin). </w:t>
       </w:r>
     </w:p>
     <w:p>
@@ -260,117 +134,12 @@
           <w:bCs/>
         </w:rPr>
       </w:pPr>
-    </w:p>
-    <w:p>
-      <w:pPr>
-        <w:rPr>
-          <w:b/>
-          <w:bCs/>
-        </w:rPr>
-      </w:pPr>
-    </w:p>
-    <w:p>
-      <w:pPr>
-        <w:rPr>
-          <w:b/>
-          <w:bCs/>
-        </w:rPr>
-      </w:pPr>
-    </w:p>
-    <w:p>
-      <w:pPr>
-        <w:rPr>
-          <w:b/>
-          <w:bCs/>
-        </w:rPr>
-      </w:pPr>
-    </w:p>
-    <w:p>
-      <w:pPr>
-        <w:rPr>
-          <w:b/>
-          <w:bCs/>
-        </w:rPr>
-      </w:pPr>
-    </w:p>
-    <w:p>
-      <w:pPr>
-        <w:rPr>
-          <w:b/>
-          <w:bCs/>
-        </w:rPr>
-      </w:pPr>
-    </w:p>
-    <w:p>
-      <w:pPr>
-        <w:rPr>
-          <w:b/>
-          <w:bCs/>
-        </w:rPr>
-      </w:pPr>
-    </w:p>
-    <w:p>
-      <w:pPr>
-        <w:rPr>
-          <w:b/>
-          <w:bCs/>
-        </w:rPr>
-      </w:pPr>
-    </w:p>
-    <w:p>
-      <w:pPr>
-        <w:rPr>
-          <w:b/>
-          <w:bCs/>
-        </w:rPr>
-      </w:pPr>
-    </w:p>
-    <w:p>
-      <w:pPr>
-        <w:rPr>
-          <w:b/>
-          <w:bCs/>
-        </w:rPr>
-      </w:pPr>
-    </w:p>
-    <w:p>
-      <w:pPr>
-        <w:rPr>
-          <w:b/>
-          <w:bCs/>
-        </w:rPr>
-      </w:pPr>
-    </w:p>
-    <w:p>
-      <w:pPr>
-        <w:rPr>
-          <w:b/>
-          <w:bCs/>
-        </w:rPr>
-      </w:pPr>
-    </w:p>
-    <w:p>
-      <w:pPr>
-        <w:rPr>
-          <w:b/>
-          <w:bCs/>
-        </w:rPr>
-      </w:pPr>
-    </w:p>
-    <w:p>
-      <w:pPr>
-        <w:rPr>
-          <w:b/>
-          <w:bCs/>
-        </w:rPr>
-      </w:pPr>
       <w:r>
         <w:rPr>
           <w:b/>
           <w:bCs/>
         </w:rPr>
-        <w:lastRenderedPageBreak/>
-        <w:t>Database Schema Adjustments</w:t>
+        <w:t>2. Database Schema Adjustments</w:t>
       </w:r>
     </w:p>
     <w:p>
@@ -385,23 +154,7 @@
           <w:b/>
           <w:bCs/>
         </w:rPr>
-        <w:t xml:space="preserve">To support brute-force tracking, the following schema modification must be executed in the </w:t>
-      </w:r>
-      <w:proofErr w:type="spellStart"/>
-      <w:r>
-        <w:rPr>
-          <w:b/>
-          <w:bCs/>
-        </w:rPr>
-        <w:t>Supabase</w:t>
-      </w:r>
-      <w:proofErr w:type="spellEnd"/>
-      <w:r>
-        <w:rPr>
-          <w:b/>
-          <w:bCs/>
-        </w:rPr>
-        <w:t xml:space="preserve"> SQL Editor:</w:t>
+        <w:t xml:space="preserve">To support the current authentication state, brute-force tracking, and rate-limiting features, the following schema columns must exist in the Supabase SQL Editor: </w:t>
       </w:r>
     </w:p>
     <w:p>
@@ -431,23 +184,7 @@
           <w:b/>
           <w:bCs/>
         </w:rPr>
-        <w:t xml:space="preserve">ALTER TABLE users ADD COLUMN </w:t>
-      </w:r>
-      <w:proofErr w:type="spellStart"/>
-      <w:r>
-        <w:rPr>
-          <w:b/>
-          <w:bCs/>
-        </w:rPr>
-        <w:t>failed_otp_attempts</w:t>
-      </w:r>
-      <w:proofErr w:type="spellEnd"/>
-      <w:r>
-        <w:rPr>
-          <w:b/>
-          <w:bCs/>
-        </w:rPr>
-        <w:t xml:space="preserve"> INT DEFAULT 0;</w:t>
+        <w:t>ALTER TABLE users ADD COLUMN failed_otp_attempts INT DEFAULT 0;</w:t>
       </w:r>
     </w:p>
     <w:p>
@@ -462,7 +199,67 @@
           <w:b/>
           <w:bCs/>
         </w:rPr>
-        <w:t>2. Codebase Map &amp; Component Breakdown</w:t>
+        <w:t>ALTER TABLE users ADD COLUMN last_username_change TIMESTAMP;</w:t>
+      </w:r>
+    </w:p>
+    <w:p>
+      <w:pPr>
+        <w:rPr>
+          <w:b/>
+          <w:bCs/>
+        </w:rPr>
+      </w:pPr>
+      <w:r>
+        <w:rPr>
+          <w:b/>
+          <w:bCs/>
+        </w:rPr>
+        <w:t>ALTER TABLE users ADD COLUMN is_verified BOOLEAN DEFAULT false;</w:t>
+      </w:r>
+    </w:p>
+    <w:p>
+      <w:pPr>
+        <w:rPr>
+          <w:b/>
+          <w:bCs/>
+        </w:rPr>
+      </w:pPr>
+      <w:r>
+        <w:rPr>
+          <w:b/>
+          <w:bCs/>
+        </w:rPr>
+        <w:t>ALTER TABLE users ADD COLUMN verification_token TEXT;</w:t>
+      </w:r>
+    </w:p>
+    <w:p>
+      <w:pPr>
+        <w:rPr>
+          <w:b/>
+          <w:bCs/>
+        </w:rPr>
+      </w:pPr>
+      <w:r>
+        <w:rPr>
+          <w:b/>
+          <w:bCs/>
+        </w:rPr>
+        <w:t>ALTER TABLE users ADD COLUMN token_expiry TIMESTAMP;</w:t>
+      </w:r>
+    </w:p>
+    <w:p>
+      <w:pPr>
+        <w:rPr>
+          <w:b/>
+          <w:bCs/>
+        </w:rPr>
+      </w:pPr>
+      <w:r>
+        <w:rPr>
+          <w:b/>
+          <w:bCs/>
+        </w:rPr>
+        <w:t>3. Codebase Map &amp; Component Breakdown</w:t>
       </w:r>
     </w:p>
     <w:p>
@@ -491,66 +288,8 @@
         <w:rPr>
           <w:b/>
           <w:bCs/>
-          <w:i/>
-          <w:iCs/>
-        </w:rPr>
-        <w:t>File Path:</w:t>
-      </w:r>
-      <w:r>
-        <w:rPr>
-          <w:b/>
-          <w:bCs/>
-        </w:rPr>
-        <w:t xml:space="preserve"> </w:t>
-      </w:r>
-      <w:proofErr w:type="spellStart"/>
-      <w:r>
-        <w:rPr>
-          <w:b/>
-          <w:bCs/>
-        </w:rPr>
-        <w:t>src</w:t>
-      </w:r>
-      <w:proofErr w:type="spellEnd"/>
-      <w:r>
-        <w:rPr>
-          <w:b/>
-          <w:bCs/>
-        </w:rPr>
-        <w:t>/app/actions/</w:t>
-      </w:r>
-      <w:proofErr w:type="spellStart"/>
-      <w:r>
-        <w:rPr>
-          <w:b/>
-          <w:bCs/>
-        </w:rPr>
-        <w:t>auth.ts</w:t>
-      </w:r>
-      <w:proofErr w:type="spellEnd"/>
-    </w:p>
-    <w:p>
-      <w:pPr>
-        <w:rPr>
-          <w:b/>
-          <w:bCs/>
-        </w:rPr>
-      </w:pPr>
-      <w:r>
-        <w:rPr>
-          <w:b/>
-          <w:bCs/>
-          <w:i/>
-          <w:iCs/>
-        </w:rPr>
-        <w:t>Responsibility:</w:t>
-      </w:r>
-      <w:r>
-        <w:rPr>
-          <w:b/>
-          <w:bCs/>
-        </w:rPr>
-        <w:t xml:space="preserve"> Houses all server-side logic, database interactions, encryption routines, and the email failover dispatch system.</w:t>
+        </w:rPr>
+        <w:t>File Path: app/actions/auth.ts</w:t>
       </w:r>
     </w:p>
     <w:p>
@@ -564,285 +303,130 @@
         <w:rPr>
           <w:b/>
           <w:bCs/>
-          <w:i/>
-          <w:iCs/>
-        </w:rPr>
-        <w:t>Key Exported Functions:</w:t>
+        </w:rPr>
+        <w:t xml:space="preserve">Responsibility: Houses all server-side logic, database interactions, encryption routines, and the 4-tier email failover dispatch system. Key Exported Functions: </w:t>
       </w:r>
     </w:p>
     <w:p>
       <w:pPr>
         <w:numPr>
           <w:ilvl w:val="0"/>
-          <w:numId w:val="5"/>
+          <w:numId w:val="9"/>
         </w:numPr>
         <w:rPr>
           <w:b/>
           <w:bCs/>
         </w:rPr>
       </w:pPr>
-      <w:proofErr w:type="spellStart"/>
       <w:r>
         <w:rPr>
           <w:b/>
           <w:bCs/>
         </w:rPr>
-        <w:t>registerUser</w:t>
+        <w:t xml:space="preserve">registerUser(formData): Validates inputs, converts emails/usernames to lowercase, enforces 15-minute verification window rules against registration hijacking, hashes </w:t>
       </w:r>
-      <w:proofErr w:type="spellEnd"/>
       <w:r>
         <w:rPr>
           <w:b/>
           <w:bCs/>
         </w:rPr>
-        <w:t>(</w:t>
-      </w:r>
-      <w:proofErr w:type="spellStart"/>
-      <w:r>
-        <w:rPr>
-          <w:b/>
-          <w:bCs/>
-        </w:rPr>
-        <w:t>formData</w:t>
-      </w:r>
-      <w:proofErr w:type="spellEnd"/>
-      <w:r>
-        <w:rPr>
-          <w:b/>
-          <w:bCs/>
-        </w:rPr>
-        <w:t>): Validates inputs, handles username/email sweeping, enforces 15-minute verification window rules against registration hijacking, hashes passwords, generates secure OTPs using Node's native crypto CSPRNG, and triggers the email dispatch.</w:t>
+        <w:lastRenderedPageBreak/>
+        <w:t xml:space="preserve">passwords, generates secure 6-digit OTPs using Node's native crypto.randomInt, and triggers the email dispatch. </w:t>
       </w:r>
     </w:p>
     <w:p>
       <w:pPr>
         <w:numPr>
           <w:ilvl w:val="0"/>
-          <w:numId w:val="5"/>
+          <w:numId w:val="9"/>
         </w:numPr>
         <w:rPr>
           <w:b/>
           <w:bCs/>
         </w:rPr>
       </w:pPr>
-      <w:proofErr w:type="spellStart"/>
-      <w:proofErr w:type="gramStart"/>
       <w:r>
         <w:rPr>
           <w:b/>
           <w:bCs/>
         </w:rPr>
-        <w:t>verifyUserEmail</w:t>
-      </w:r>
-      <w:proofErr w:type="spellEnd"/>
-      <w:r>
-        <w:rPr>
-          <w:b/>
-          <w:bCs/>
-        </w:rPr>
-        <w:t>(</w:t>
-      </w:r>
-      <w:proofErr w:type="gramEnd"/>
-      <w:r>
-        <w:rPr>
-          <w:b/>
-          <w:bCs/>
-        </w:rPr>
-        <w:t xml:space="preserve">email, </w:t>
-      </w:r>
-      <w:proofErr w:type="spellStart"/>
-      <w:r>
-        <w:rPr>
-          <w:b/>
-          <w:bCs/>
-        </w:rPr>
-        <w:t>otp</w:t>
-      </w:r>
-      <w:proofErr w:type="spellEnd"/>
-      <w:r>
-        <w:rPr>
-          <w:b/>
-          <w:bCs/>
-        </w:rPr>
-        <w:t>): Evaluates token expiry before token validity, manages the 5-attempt brute-force self-destruction threshold, and finalizes user activation.</w:t>
+        <w:t xml:space="preserve">verifyUserEmail(email, otp): Evaluates token expiry, manages the 5-attempt brute-force self-destruction threshold, and finalizes user activation by setting is_verified to true. </w:t>
       </w:r>
     </w:p>
     <w:p>
       <w:pPr>
         <w:numPr>
           <w:ilvl w:val="0"/>
-          <w:numId w:val="5"/>
+          <w:numId w:val="9"/>
         </w:numPr>
         <w:rPr>
           <w:b/>
           <w:bCs/>
         </w:rPr>
       </w:pPr>
-      <w:proofErr w:type="spellStart"/>
       <w:r>
         <w:rPr>
           <w:b/>
           <w:bCs/>
         </w:rPr>
-        <w:t>resendVerificationCode</w:t>
-      </w:r>
-      <w:proofErr w:type="spellEnd"/>
-      <w:r>
-        <w:rPr>
-          <w:b/>
-          <w:bCs/>
-        </w:rPr>
-        <w:t xml:space="preserve">(email): Generates fresh 15-minute OTP lifecycles via CSPRNG. </w:t>
-      </w:r>
-      <w:r>
-        <w:rPr>
-          <w:b/>
-          <w:bCs/>
-          <w:i/>
-          <w:iCs/>
-        </w:rPr>
-        <w:t>Note: Failure meters deliberately persist across resend requests to prevent infinite brute-force loops.</w:t>
+        <w:t xml:space="preserve">resendVerificationCode(email): Generates fresh 15-minute OTP lifecycles via CSPRNG. Note: Failure meters deliberately persist across resend requests to prevent infinite brute-force loops. </w:t>
       </w:r>
     </w:p>
     <w:p>
       <w:pPr>
         <w:numPr>
           <w:ilvl w:val="0"/>
-          <w:numId w:val="5"/>
+          <w:numId w:val="9"/>
         </w:numPr>
         <w:rPr>
           <w:b/>
           <w:bCs/>
         </w:rPr>
       </w:pPr>
-      <w:proofErr w:type="spellStart"/>
       <w:r>
         <w:rPr>
           <w:b/>
           <w:bCs/>
         </w:rPr>
-        <w:t>requestPasswordReset</w:t>
-      </w:r>
-      <w:proofErr w:type="spellEnd"/>
-      <w:r>
-        <w:rPr>
-          <w:b/>
-          <w:bCs/>
-        </w:rPr>
-        <w:t>(email): Initiates secure recovery workflows while masking user existence to prevent account enumeration.</w:t>
+        <w:t xml:space="preserve">requestPasswordReset(email): Initiates secure recovery workflows while masking user existence to prevent account enumeration. Resets the OTP failure counter. </w:t>
       </w:r>
     </w:p>
     <w:p>
       <w:pPr>
         <w:numPr>
           <w:ilvl w:val="0"/>
-          <w:numId w:val="5"/>
+          <w:numId w:val="9"/>
         </w:numPr>
         <w:rPr>
           <w:b/>
           <w:bCs/>
         </w:rPr>
       </w:pPr>
-      <w:proofErr w:type="spellStart"/>
-      <w:proofErr w:type="gramStart"/>
       <w:r>
         <w:rPr>
           <w:b/>
           <w:bCs/>
         </w:rPr>
-        <w:t>resetPassword</w:t>
-      </w:r>
-      <w:proofErr w:type="spellEnd"/>
-      <w:r>
-        <w:rPr>
-          <w:b/>
-          <w:bCs/>
-        </w:rPr>
-        <w:t>(</w:t>
-      </w:r>
-      <w:proofErr w:type="gramEnd"/>
-      <w:r>
-        <w:rPr>
-          <w:b/>
-          <w:bCs/>
-        </w:rPr>
-        <w:t xml:space="preserve">email, </w:t>
-      </w:r>
-      <w:proofErr w:type="spellStart"/>
-      <w:r>
-        <w:rPr>
-          <w:b/>
-          <w:bCs/>
-        </w:rPr>
-        <w:t>otp</w:t>
-      </w:r>
-      <w:proofErr w:type="spellEnd"/>
-      <w:r>
-        <w:rPr>
-          <w:b/>
-          <w:bCs/>
-        </w:rPr>
-        <w:t xml:space="preserve">, </w:t>
-      </w:r>
-      <w:proofErr w:type="spellStart"/>
-      <w:r>
-        <w:rPr>
-          <w:b/>
-          <w:bCs/>
-        </w:rPr>
-        <w:t>newPassword</w:t>
-      </w:r>
-      <w:proofErr w:type="spellEnd"/>
-      <w:r>
-        <w:rPr>
-          <w:b/>
-          <w:bCs/>
-        </w:rPr>
-        <w:t xml:space="preserve">): Validates OTP lifecycles (checking expiry first), checks historical password reuse via </w:t>
-      </w:r>
-      <w:proofErr w:type="spellStart"/>
-      <w:r>
-        <w:rPr>
-          <w:b/>
-          <w:bCs/>
-        </w:rPr>
-        <w:t>bcrypt</w:t>
-      </w:r>
-      <w:proofErr w:type="spellEnd"/>
-      <w:r>
-        <w:rPr>
-          <w:b/>
-          <w:bCs/>
-        </w:rPr>
-        <w:t>, rotates credentials, and destroys tokens to prevent replay attacks.</w:t>
+        <w:t xml:space="preserve">resetPassword(email, otp, newPassword): Validates OTP lifecycles, checks historical password reuse via bcrypt, rotates credentials, destroys tokens to prevent replay attacks, and resets attempt counters. </w:t>
       </w:r>
     </w:p>
     <w:p>
       <w:pPr>
         <w:numPr>
           <w:ilvl w:val="0"/>
-          <w:numId w:val="5"/>
+          <w:numId w:val="9"/>
         </w:numPr>
         <w:rPr>
           <w:b/>
           <w:bCs/>
         </w:rPr>
       </w:pPr>
-      <w:proofErr w:type="spellStart"/>
       <w:r>
         <w:rPr>
           <w:b/>
           <w:bCs/>
         </w:rPr>
-        <w:t>isUsernameAvailable</w:t>
-      </w:r>
-      <w:proofErr w:type="spellEnd"/>
-      <w:r>
-        <w:rPr>
-          <w:b/>
-          <w:bCs/>
-        </w:rPr>
-        <w:t>(username): Queries real-time availability including automated cleanups of expired ghost accounts.</w:t>
+        <w:t xml:space="preserve">isUsernameAvailable(username): Queries real-time availability including automated cleanups of expired ghost accounts. </w:t>
       </w:r>
     </w:p>
     <w:p>
@@ -852,95 +436,12 @@
           <w:bCs/>
         </w:rPr>
       </w:pPr>
-    </w:p>
-    <w:p>
-      <w:pPr>
-        <w:rPr>
-          <w:b/>
-          <w:bCs/>
-        </w:rPr>
-      </w:pPr>
-    </w:p>
-    <w:p>
-      <w:pPr>
-        <w:rPr>
-          <w:b/>
-          <w:bCs/>
-        </w:rPr>
-      </w:pPr>
-    </w:p>
-    <w:p>
-      <w:pPr>
-        <w:rPr>
-          <w:b/>
-          <w:bCs/>
-        </w:rPr>
-      </w:pPr>
       <w:r>
         <w:rPr>
           <w:b/>
           <w:bCs/>
-          <w:i/>
-          <w:iCs/>
-        </w:rPr>
-        <w:lastRenderedPageBreak/>
-        <w:t>File Path:</w:t>
-      </w:r>
-      <w:r>
-        <w:rPr>
-          <w:b/>
-          <w:bCs/>
-        </w:rPr>
-        <w:t xml:space="preserve"> </w:t>
-      </w:r>
-      <w:proofErr w:type="spellStart"/>
-      <w:r>
-        <w:rPr>
-          <w:b/>
-          <w:bCs/>
-        </w:rPr>
-        <w:t>src</w:t>
-      </w:r>
-      <w:proofErr w:type="spellEnd"/>
-      <w:r>
-        <w:rPr>
-          <w:b/>
-          <w:bCs/>
-        </w:rPr>
-        <w:t>/app/actions/</w:t>
-      </w:r>
-      <w:proofErr w:type="spellStart"/>
-      <w:r>
-        <w:rPr>
-          <w:b/>
-          <w:bCs/>
-        </w:rPr>
-        <w:t>profile.ts</w:t>
-      </w:r>
-      <w:proofErr w:type="spellEnd"/>
-    </w:p>
-    <w:p>
-      <w:pPr>
-        <w:rPr>
-          <w:b/>
-          <w:bCs/>
-        </w:rPr>
-      </w:pPr>
-      <w:r>
-        <w:rPr>
-          <w:b/>
-          <w:bCs/>
-          <w:i/>
-          <w:iCs/>
-        </w:rPr>
-        <w:t>Responsibility:</w:t>
-      </w:r>
-      <w:r>
-        <w:rPr>
-          <w:b/>
-          <w:bCs/>
-        </w:rPr>
-        <w:t xml:space="preserve"> Secures profile data mutations and fetches.</w:t>
+        </w:rPr>
+        <w:t>File Path: app/actions/profile.ts</w:t>
       </w:r>
     </w:p>
     <w:p>
@@ -954,102 +455,179 @@
         <w:rPr>
           <w:b/>
           <w:bCs/>
-          <w:i/>
-          <w:iCs/>
-        </w:rPr>
-        <w:t>Key Exported Functions:</w:t>
+        </w:rPr>
+        <w:t xml:space="preserve">Responsibility: Secures profile data mutations and fetches. Key Exported Functions: </w:t>
       </w:r>
     </w:p>
     <w:p>
       <w:pPr>
         <w:numPr>
           <w:ilvl w:val="0"/>
-          <w:numId w:val="6"/>
+          <w:numId w:val="10"/>
         </w:numPr>
         <w:rPr>
           <w:b/>
           <w:bCs/>
         </w:rPr>
       </w:pPr>
-      <w:proofErr w:type="spellStart"/>
       <w:r>
         <w:rPr>
           <w:b/>
           <w:bCs/>
         </w:rPr>
-        <w:t>updateAvatarUrl</w:t>
+        <w:t xml:space="preserve">updateAvatarUrl / updateProfileData / getUserProfile / updateBannerUrl: Executes database updates and fetches by deriving the user ID exclusively from the active server session (getServerSession), completely eliminating IDOR vulnerabilities from client-supplied IDs. </w:t>
       </w:r>
-      <w:proofErr w:type="spellEnd"/>
+    </w:p>
+    <w:p>
+      <w:pPr>
+        <w:numPr>
+          <w:ilvl w:val="0"/>
+          <w:numId w:val="10"/>
+        </w:numPr>
+        <w:rPr>
+          <w:b/>
+          <w:bCs/>
+        </w:rPr>
+      </w:pPr>
       <w:r>
         <w:rPr>
           <w:b/>
           <w:bCs/>
         </w:rPr>
-        <w:t xml:space="preserve"> / </w:t>
+        <w:t xml:space="preserve">updateProfileData: Specifically enforces a 30-day cooldown period on username changes to prevent abuse. </w:t>
       </w:r>
-      <w:proofErr w:type="spellStart"/>
+    </w:p>
+    <w:p>
+      <w:pPr>
+        <w:rPr>
+          <w:b/>
+          <w:bCs/>
+        </w:rPr>
+      </w:pPr>
       <w:r>
         <w:rPr>
           <w:b/>
           <w:bCs/>
         </w:rPr>
-        <w:t>updateProfileData</w:t>
+        <w:t>Authentication API &amp; Middleware</w:t>
       </w:r>
-      <w:proofErr w:type="spellEnd"/>
+    </w:p>
+    <w:p>
+      <w:pPr>
+        <w:rPr>
+          <w:b/>
+          <w:bCs/>
+        </w:rPr>
+      </w:pPr>
       <w:r>
         <w:rPr>
           <w:b/>
           <w:bCs/>
         </w:rPr>
-        <w:t xml:space="preserve"> / </w:t>
+        <w:t>File Path: app/api/auth/[...nextauth]/route.tsx</w:t>
       </w:r>
-      <w:proofErr w:type="spellStart"/>
+    </w:p>
+    <w:p>
+      <w:pPr>
+        <w:rPr>
+          <w:b/>
+          <w:bCs/>
+        </w:rPr>
+      </w:pPr>
       <w:r>
         <w:rPr>
           <w:b/>
           <w:bCs/>
         </w:rPr>
-        <w:t>getUserProfile</w:t>
+        <w:t xml:space="preserve">Responsibility: Manages the NextAuth core configuration and session JWT creation. </w:t>
       </w:r>
-      <w:proofErr w:type="spellEnd"/>
+    </w:p>
+    <w:p>
+      <w:pPr>
+        <w:numPr>
+          <w:ilvl w:val="0"/>
+          <w:numId w:val="11"/>
+        </w:numPr>
+        <w:rPr>
+          <w:b/>
+          <w:bCs/>
+        </w:rPr>
+      </w:pPr>
       <w:r>
         <w:rPr>
           <w:b/>
           <w:bCs/>
         </w:rPr>
-        <w:t>: Executes database updates and fetches by deriving the user ID exclusively from the active server session (</w:t>
+        <w:t xml:space="preserve">Boot-time environment guards crash the app if NEXTAUTH_SECRET is missing. </w:t>
       </w:r>
-      <w:proofErr w:type="spellStart"/>
+    </w:p>
+    <w:p>
+      <w:pPr>
+        <w:numPr>
+          <w:ilvl w:val="0"/>
+          <w:numId w:val="11"/>
+        </w:numPr>
+        <w:rPr>
+          <w:b/>
+          <w:bCs/>
+        </w:rPr>
+      </w:pPr>
       <w:r>
         <w:rPr>
           <w:b/>
           <w:bCs/>
         </w:rPr>
-        <w:t>getServerSession</w:t>
+        <w:t xml:space="preserve">The authorize callback blocks login attempts from unverified accounts and utilizes generic error messages to prevent user enumeration. </w:t>
       </w:r>
-      <w:proofErr w:type="spellEnd"/>
+    </w:p>
+    <w:p>
+      <w:pPr>
+        <w:rPr>
+          <w:b/>
+          <w:bCs/>
+        </w:rPr>
+      </w:pPr>
       <w:r>
         <w:rPr>
           <w:b/>
           <w:bCs/>
         </w:rPr>
-        <w:t xml:space="preserve">), </w:t>
+        <w:t>File Path: proxy.ts</w:t>
       </w:r>
-      <w:proofErr w:type="gramStart"/>
+    </w:p>
+    <w:p>
+      <w:pPr>
+        <w:rPr>
+          <w:b/>
+          <w:bCs/>
+        </w:rPr>
+      </w:pPr>
       <w:r>
         <w:rPr>
           <w:b/>
           <w:bCs/>
         </w:rPr>
-        <w:t>completely eliminating</w:t>
+        <w:lastRenderedPageBreak/>
+        <w:t xml:space="preserve">Responsibility: A root-level NextAuth middleware bouncer enforcing strict access boundaries. </w:t>
       </w:r>
-      <w:proofErr w:type="gramEnd"/>
+    </w:p>
+    <w:p>
+      <w:pPr>
+        <w:numPr>
+          <w:ilvl w:val="0"/>
+          <w:numId w:val="12"/>
+        </w:numPr>
+        <w:rPr>
+          <w:b/>
+          <w:bCs/>
+        </w:rPr>
+      </w:pPr>
       <w:r>
         <w:rPr>
           <w:b/>
           <w:bCs/>
         </w:rPr>
-        <w:t xml:space="preserve"> IDOR (Insecure Direct Object Reference) vulnerabilities from client-supplied IDs.</w:t>
+        <w:t xml:space="preserve">Configured via a matcher to protect application paths while explicitly allowing guests to view /login, /register, /verify-email, and standard static API/image assets. </w:t>
       </w:r>
     </w:p>
     <w:p>
@@ -1071,7 +649,7 @@
       <w:pPr>
         <w:numPr>
           <w:ilvl w:val="0"/>
-          <w:numId w:val="7"/>
+          <w:numId w:val="13"/>
         </w:numPr>
         <w:rPr>
           <w:b/>
@@ -1083,46 +661,14 @@
           <w:b/>
           <w:bCs/>
         </w:rPr>
-        <w:t>Registration Interface (</w:t>
-      </w:r>
-      <w:proofErr w:type="spellStart"/>
-      <w:r>
-        <w:rPr>
-          <w:b/>
-          <w:bCs/>
-        </w:rPr>
-        <w:t>src</w:t>
-      </w:r>
-      <w:proofErr w:type="spellEnd"/>
-      <w:r>
-        <w:rPr>
-          <w:b/>
-          <w:bCs/>
-        </w:rPr>
-        <w:t>/app/register/</w:t>
-      </w:r>
-      <w:proofErr w:type="spellStart"/>
-      <w:r>
-        <w:rPr>
-          <w:b/>
-          <w:bCs/>
-        </w:rPr>
-        <w:t>page.tsx</w:t>
-      </w:r>
-      <w:proofErr w:type="spellEnd"/>
-      <w:r>
-        <w:rPr>
-          <w:b/>
-          <w:bCs/>
-        </w:rPr>
-        <w:t>): Features animated floating inputs, real-time debounce checking for username availability, live password visibility toggling, date-of-birth constraints, and shake animations on validation failure.</w:t>
+        <w:t xml:space="preserve">Registration Interface (app/register/page.tsx): Features animated floating inputs, a DB validation trigger that fires onBlur to prevent excessive API calls, live password visibility toggling, date-of-birth constraints, and shake animations on validation failure. </w:t>
       </w:r>
     </w:p>
     <w:p>
       <w:pPr>
         <w:numPr>
           <w:ilvl w:val="0"/>
-          <w:numId w:val="7"/>
+          <w:numId w:val="13"/>
         </w:numPr>
         <w:rPr>
           <w:b/>
@@ -1134,46 +680,14 @@
           <w:b/>
           <w:bCs/>
         </w:rPr>
-        <w:t>Email Verification (</w:t>
-      </w:r>
-      <w:proofErr w:type="spellStart"/>
-      <w:r>
-        <w:rPr>
-          <w:b/>
-          <w:bCs/>
-        </w:rPr>
-        <w:t>src</w:t>
-      </w:r>
-      <w:proofErr w:type="spellEnd"/>
-      <w:r>
-        <w:rPr>
-          <w:b/>
-          <w:bCs/>
-        </w:rPr>
-        <w:t>/app/verify-email/</w:t>
-      </w:r>
-      <w:proofErr w:type="spellStart"/>
-      <w:r>
-        <w:rPr>
-          <w:b/>
-          <w:bCs/>
-        </w:rPr>
-        <w:t>page.tsx</w:t>
-      </w:r>
-      <w:proofErr w:type="spellEnd"/>
-      <w:r>
-        <w:rPr>
-          <w:b/>
-          <w:bCs/>
-        </w:rPr>
-        <w:t>): Processes 6-digit confirmation codes, handles client-side countdown timers for resend constraints, and routes verified sessions directly into the application grid.</w:t>
+        <w:t xml:space="preserve">Email Verification (app/verify-email/page.tsx): Processes 6-digit confirmation codes, handles client-side countdown timers (120 seconds) for resend constraints, and routes verified sessions directly into the application grid. </w:t>
       </w:r>
     </w:p>
     <w:p>
       <w:pPr>
         <w:numPr>
           <w:ilvl w:val="0"/>
-          <w:numId w:val="7"/>
+          <w:numId w:val="13"/>
         </w:numPr>
         <w:rPr>
           <w:b/>
@@ -1185,46 +699,14 @@
           <w:b/>
           <w:bCs/>
         </w:rPr>
-        <w:t>Password Reset Wizard (</w:t>
-      </w:r>
-      <w:proofErr w:type="spellStart"/>
-      <w:r>
-        <w:rPr>
-          <w:b/>
-          <w:bCs/>
-        </w:rPr>
-        <w:t>src</w:t>
-      </w:r>
-      <w:proofErr w:type="spellEnd"/>
-      <w:r>
-        <w:rPr>
-          <w:b/>
-          <w:bCs/>
-        </w:rPr>
-        <w:t>/app/forgot-password/</w:t>
-      </w:r>
-      <w:proofErr w:type="spellStart"/>
-      <w:r>
-        <w:rPr>
-          <w:b/>
-          <w:bCs/>
-        </w:rPr>
-        <w:t>page.tsx</w:t>
-      </w:r>
-      <w:proofErr w:type="spellEnd"/>
-      <w:r>
-        <w:rPr>
-          <w:b/>
-          <w:bCs/>
-        </w:rPr>
-        <w:t>): A two-step state machine separating email submission (Step 1) from authorized OTP confirmation and double-entry password matching (Step 2).</w:t>
+        <w:t xml:space="preserve">Password Reset Wizard (app/forgot-password/page.tsx): A two-step state machine separating email submission (Step 1) from authorized OTP confirmation and double-entry password matching (Step 2). </w:t>
       </w:r>
     </w:p>
     <w:p>
       <w:pPr>
         <w:numPr>
           <w:ilvl w:val="0"/>
-          <w:numId w:val="7"/>
+          <w:numId w:val="13"/>
         </w:numPr>
         <w:rPr>
           <w:b/>
@@ -1236,39 +718,7 @@
           <w:b/>
           <w:bCs/>
         </w:rPr>
-        <w:t>Route Protection (</w:t>
-      </w:r>
-      <w:proofErr w:type="spellStart"/>
-      <w:r>
-        <w:rPr>
-          <w:b/>
-          <w:bCs/>
-        </w:rPr>
-        <w:t>src</w:t>
-      </w:r>
-      <w:proofErr w:type="spellEnd"/>
-      <w:r>
-        <w:rPr>
-          <w:b/>
-          <w:bCs/>
-        </w:rPr>
-        <w:t>/</w:t>
-      </w:r>
-      <w:proofErr w:type="spellStart"/>
-      <w:r>
-        <w:rPr>
-          <w:b/>
-          <w:bCs/>
-        </w:rPr>
-        <w:t>middleware.ts</w:t>
-      </w:r>
-      <w:proofErr w:type="spellEnd"/>
-      <w:r>
-        <w:rPr>
-          <w:b/>
-          <w:bCs/>
-        </w:rPr>
-        <w:t>): A root-level bouncer enforcing strict access boundaries across protected paths like /home, /profile, /hubs, and /events.</w:t>
+        <w:t xml:space="preserve">Login Interface (app/login/page.tsx): Handles NextAuth credentials login, catches URL query parameters (e.g., successful password reset toasts), and provides visual feedback for rate limiting and generic credential errors. </w:t>
       </w:r>
     </w:p>
     <w:p>
@@ -1278,93 +728,12 @@
           <w:bCs/>
         </w:rPr>
       </w:pPr>
-    </w:p>
-    <w:p>
-      <w:pPr>
-        <w:rPr>
-          <w:b/>
-          <w:bCs/>
-        </w:rPr>
-      </w:pPr>
-    </w:p>
-    <w:p>
-      <w:pPr>
-        <w:rPr>
-          <w:b/>
-          <w:bCs/>
-        </w:rPr>
-      </w:pPr>
-    </w:p>
-    <w:p>
-      <w:pPr>
-        <w:rPr>
-          <w:b/>
-          <w:bCs/>
-        </w:rPr>
-      </w:pPr>
-    </w:p>
-    <w:p>
-      <w:pPr>
-        <w:rPr>
-          <w:b/>
-          <w:bCs/>
-        </w:rPr>
-      </w:pPr>
-    </w:p>
-    <w:p>
-      <w:pPr>
-        <w:rPr>
-          <w:b/>
-          <w:bCs/>
-        </w:rPr>
-      </w:pPr>
-    </w:p>
-    <w:p>
-      <w:pPr>
-        <w:rPr>
-          <w:b/>
-          <w:bCs/>
-        </w:rPr>
-      </w:pPr>
-    </w:p>
-    <w:p>
-      <w:pPr>
-        <w:rPr>
-          <w:b/>
-          <w:bCs/>
-        </w:rPr>
-      </w:pPr>
-    </w:p>
-    <w:p>
-      <w:pPr>
-        <w:rPr>
-          <w:b/>
-          <w:bCs/>
-        </w:rPr>
-      </w:pPr>
-    </w:p>
-    <w:p>
-      <w:pPr>
-        <w:rPr>
-          <w:b/>
-          <w:bCs/>
-        </w:rPr>
-      </w:pPr>
-    </w:p>
-    <w:p>
-      <w:pPr>
-        <w:rPr>
-          <w:b/>
-          <w:bCs/>
-        </w:rPr>
-      </w:pPr>
       <w:r>
         <w:rPr>
           <w:b/>
           <w:bCs/>
         </w:rPr>
-        <w:lastRenderedPageBreak/>
-        <w:t>3. Security Architecture Matrix</w:t>
+        <w:t>4. Security Architecture Matrix</w:t>
       </w:r>
     </w:p>
     <w:p>
@@ -1395,9 +764,9 @@
         <w:tblLook w:val="04A0" w:firstRow="1" w:lastRow="0" w:firstColumn="1" w:lastColumn="0" w:noHBand="0" w:noVBand="1"/>
       </w:tblPr>
       <w:tblGrid>
-        <w:gridCol w:w="1969"/>
-        <w:gridCol w:w="4312"/>
-        <w:gridCol w:w="3063"/>
+        <w:gridCol w:w="2082"/>
+        <w:gridCol w:w="3135"/>
+        <w:gridCol w:w="4127"/>
       </w:tblGrid>
       <w:tr>
         <w:trPr>
@@ -1575,7 +944,7 @@
                 <w:b/>
                 <w:bCs/>
               </w:rPr>
-              <w:t>IP-based sliding window rate-limiting (Max 5 requests per 60 seconds per client).</w:t>
+              <w:t xml:space="preserve">IP-based sliding window rate-limiting (Max 5 requests per 60 seconds per client). </w:t>
             </w:r>
           </w:p>
         </w:tc>
@@ -1604,228 +973,12 @@
                 <w:bCs/>
               </w:rPr>
             </w:pPr>
-            <w:proofErr w:type="spellStart"/>
             <w:r>
               <w:rPr>
                 <w:b/>
                 <w:bCs/>
               </w:rPr>
-              <w:t>authRateLimiter</w:t>
-            </w:r>
-            <w:proofErr w:type="spellEnd"/>
-            <w:r>
-              <w:rPr>
-                <w:b/>
-                <w:bCs/>
-              </w:rPr>
-              <w:t xml:space="preserve"> inside </w:t>
-            </w:r>
-            <w:proofErr w:type="spellStart"/>
-            <w:r>
-              <w:rPr>
-                <w:b/>
-                <w:bCs/>
-              </w:rPr>
-              <w:t>src</w:t>
-            </w:r>
-            <w:proofErr w:type="spellEnd"/>
-            <w:r>
-              <w:rPr>
-                <w:b/>
-                <w:bCs/>
-              </w:rPr>
-              <w:t>/app/actions/</w:t>
-            </w:r>
-            <w:proofErr w:type="spellStart"/>
-            <w:r>
-              <w:rPr>
-                <w:b/>
-                <w:bCs/>
-              </w:rPr>
-              <w:t>auth.ts</w:t>
-            </w:r>
-            <w:proofErr w:type="spellEnd"/>
-          </w:p>
-        </w:tc>
-      </w:tr>
-      <w:tr>
-        <w:trPr>
-          <w:tblCellSpacing w:w="15" w:type="dxa"/>
-        </w:trPr>
-        <w:tc>
-          <w:tcPr>
-            <w:tcW w:w="0" w:type="auto"/>
-            <w:tcBorders>
-              <w:top w:val="single" w:sz="6" w:space="0" w:color="C4C7C5"/>
-              <w:left w:val="single" w:sz="6" w:space="0" w:color="C4C7C5"/>
-              <w:bottom w:val="single" w:sz="6" w:space="0" w:color="C4C7C5"/>
-              <w:right w:val="single" w:sz="6" w:space="0" w:color="C4C7C5"/>
-            </w:tcBorders>
-            <w:tcMar>
-              <w:top w:w="120" w:type="dxa"/>
-              <w:left w:w="180" w:type="dxa"/>
-              <w:bottom w:w="120" w:type="dxa"/>
-              <w:right w:w="180" w:type="dxa"/>
-            </w:tcMar>
-            <w:vAlign w:val="center"/>
-            <w:hideMark/>
-          </w:tcPr>
-          <w:p>
-            <w:pPr>
-              <w:rPr>
-                <w:b/>
-                <w:bCs/>
-              </w:rPr>
-            </w:pPr>
-            <w:r>
-              <w:rPr>
-                <w:b/>
-                <w:bCs/>
-              </w:rPr>
-              <w:t>OTP Brute-Forcing</w:t>
-            </w:r>
-          </w:p>
-        </w:tc>
-        <w:tc>
-          <w:tcPr>
-            <w:tcW w:w="0" w:type="auto"/>
-            <w:tcBorders>
-              <w:top w:val="single" w:sz="6" w:space="0" w:color="C4C7C5"/>
-              <w:left w:val="single" w:sz="6" w:space="0" w:color="C4C7C5"/>
-              <w:bottom w:val="single" w:sz="6" w:space="0" w:color="C4C7C5"/>
-              <w:right w:val="single" w:sz="6" w:space="0" w:color="C4C7C5"/>
-            </w:tcBorders>
-            <w:tcMar>
-              <w:top w:w="120" w:type="dxa"/>
-              <w:left w:w="180" w:type="dxa"/>
-              <w:bottom w:w="120" w:type="dxa"/>
-              <w:right w:w="180" w:type="dxa"/>
-            </w:tcMar>
-            <w:vAlign w:val="center"/>
-            <w:hideMark/>
-          </w:tcPr>
-          <w:p>
-            <w:pPr>
-              <w:rPr>
-                <w:b/>
-                <w:bCs/>
-              </w:rPr>
-            </w:pPr>
-            <w:r>
-              <w:rPr>
-                <w:b/>
-                <w:bCs/>
-              </w:rPr>
-              <w:t>Attempt tracking counter (</w:t>
-            </w:r>
-            <w:proofErr w:type="spellStart"/>
-            <w:r>
-              <w:rPr>
-                <w:b/>
-                <w:bCs/>
-              </w:rPr>
-              <w:t>failed_otp_attempts</w:t>
-            </w:r>
-            <w:proofErr w:type="spellEnd"/>
-            <w:r>
-              <w:rPr>
-                <w:b/>
-                <w:bCs/>
-              </w:rPr>
-              <w:t xml:space="preserve">). Reaching 5 invalid entries triggers automatic token self-destruction. Token expiry is strictly evaluated </w:t>
-            </w:r>
-            <w:r>
-              <w:rPr>
-                <w:b/>
-                <w:bCs/>
-                <w:i/>
-                <w:iCs/>
-              </w:rPr>
-              <w:t>before</w:t>
-            </w:r>
-            <w:r>
-              <w:rPr>
-                <w:b/>
-                <w:bCs/>
-              </w:rPr>
-              <w:t xml:space="preserve"> token comparison.</w:t>
-            </w:r>
-          </w:p>
-        </w:tc>
-        <w:tc>
-          <w:tcPr>
-            <w:tcW w:w="0" w:type="auto"/>
-            <w:tcBorders>
-              <w:top w:val="single" w:sz="6" w:space="0" w:color="C4C7C5"/>
-              <w:left w:val="single" w:sz="6" w:space="0" w:color="C4C7C5"/>
-              <w:bottom w:val="single" w:sz="6" w:space="0" w:color="C4C7C5"/>
-              <w:right w:val="single" w:sz="6" w:space="0" w:color="C4C7C5"/>
-            </w:tcBorders>
-            <w:tcMar>
-              <w:top w:w="120" w:type="dxa"/>
-              <w:left w:w="180" w:type="dxa"/>
-              <w:bottom w:w="120" w:type="dxa"/>
-              <w:right w:w="180" w:type="dxa"/>
-            </w:tcMar>
-            <w:vAlign w:val="center"/>
-            <w:hideMark/>
-          </w:tcPr>
-          <w:p>
-            <w:pPr>
-              <w:rPr>
-                <w:b/>
-                <w:bCs/>
-              </w:rPr>
-            </w:pPr>
-            <w:proofErr w:type="spellStart"/>
-            <w:proofErr w:type="gramStart"/>
-            <w:r>
-              <w:rPr>
-                <w:b/>
-                <w:bCs/>
-              </w:rPr>
-              <w:t>verifyUserEmail</w:t>
-            </w:r>
-            <w:proofErr w:type="spellEnd"/>
-            <w:r>
-              <w:rPr>
-                <w:b/>
-                <w:bCs/>
-              </w:rPr>
-              <w:t>(</w:t>
-            </w:r>
-            <w:proofErr w:type="gramEnd"/>
-            <w:r>
-              <w:rPr>
-                <w:b/>
-                <w:bCs/>
-              </w:rPr>
-              <w:t xml:space="preserve">) &amp; </w:t>
-            </w:r>
-            <w:proofErr w:type="spellStart"/>
-            <w:proofErr w:type="gramStart"/>
-            <w:r>
-              <w:rPr>
-                <w:b/>
-                <w:bCs/>
-              </w:rPr>
-              <w:t>resetPassword</w:t>
-            </w:r>
-            <w:proofErr w:type="spellEnd"/>
-            <w:r>
-              <w:rPr>
-                <w:b/>
-                <w:bCs/>
-              </w:rPr>
-              <w:t>(</w:t>
-            </w:r>
-            <w:proofErr w:type="gramEnd"/>
-            <w:r>
-              <w:rPr>
-                <w:b/>
-                <w:bCs/>
-              </w:rPr>
-              <w:t>)</w:t>
+              <w:t>authRateLimiter inside app/actions/auth.ts</w:t>
             </w:r>
           </w:p>
         </w:tc>
@@ -1864,7 +1017,7 @@
                 <w:b/>
                 <w:bCs/>
               </w:rPr>
-              <w:t>Registration Hijacking</w:t>
+              <w:t>OTP Brute-Forcing</w:t>
             </w:r>
           </w:p>
         </w:tc>
@@ -1898,7 +1051,15 @@
                 <w:b/>
                 <w:bCs/>
               </w:rPr>
-              <w:t>Enforces the 15-minute expiry window on unverified email rows before allowing data overwrites or re-registrations.</w:t>
+              <w:t xml:space="preserve">Attempt tracking counter (failed_otp_attempts). Reaching 5 invalid entries triggers automatic token self-destruction. Token </w:t>
+            </w:r>
+            <w:r>
+              <w:rPr>
+                <w:b/>
+                <w:bCs/>
+              </w:rPr>
+              <w:lastRenderedPageBreak/>
+              <w:t xml:space="preserve">expiry is strictly evaluated before token comparison. </w:t>
             </w:r>
           </w:p>
         </w:tc>
@@ -1927,30 +1088,13 @@
                 <w:bCs/>
               </w:rPr>
             </w:pPr>
-            <w:proofErr w:type="spellStart"/>
-            <w:proofErr w:type="gramStart"/>
             <w:r>
               <w:rPr>
                 <w:b/>
                 <w:bCs/>
               </w:rPr>
-              <w:t>registerUser</w:t>
-            </w:r>
-            <w:proofErr w:type="spellEnd"/>
-            <w:r>
-              <w:rPr>
-                <w:b/>
-                <w:bCs/>
-              </w:rPr>
-              <w:t>(</w:t>
-            </w:r>
-            <w:proofErr w:type="gramEnd"/>
-            <w:r>
-              <w:rPr>
-                <w:b/>
-                <w:bCs/>
-              </w:rPr>
-              <w:t>)</w:t>
+              <w:lastRenderedPageBreak/>
+              <w:t>verifyUserEmail() &amp; resetPassword()</w:t>
             </w:r>
           </w:p>
         </w:tc>
@@ -1989,7 +1133,7 @@
                 <w:b/>
                 <w:bCs/>
               </w:rPr>
-              <w:t>IDOR (Profile Overwrites)</w:t>
+              <w:t>Registration Hijacking</w:t>
             </w:r>
           </w:p>
         </w:tc>
@@ -2023,39 +1167,7 @@
                 <w:b/>
                 <w:bCs/>
               </w:rPr>
-              <w:t xml:space="preserve">Ignores client-supplied payload IDs. Database writes </w:t>
-            </w:r>
-            <w:proofErr w:type="gramStart"/>
-            <w:r>
-              <w:rPr>
-                <w:b/>
-                <w:bCs/>
-              </w:rPr>
-              <w:t>map</w:t>
-            </w:r>
-            <w:proofErr w:type="gramEnd"/>
-            <w:r>
-              <w:rPr>
-                <w:b/>
-                <w:bCs/>
-              </w:rPr>
-              <w:t xml:space="preserve"> exclusively to the ID authenticated via </w:t>
-            </w:r>
-            <w:proofErr w:type="spellStart"/>
-            <w:r>
-              <w:rPr>
-                <w:b/>
-                <w:bCs/>
-              </w:rPr>
-              <w:t>getServerSession</w:t>
-            </w:r>
-            <w:proofErr w:type="spellEnd"/>
-            <w:r>
-              <w:rPr>
-                <w:b/>
-                <w:bCs/>
-              </w:rPr>
-              <w:t>.</w:t>
+              <w:t xml:space="preserve">Enforces the 15-minute expiry window on unverified email rows before allowing data overwrites or re-registrations. </w:t>
             </w:r>
           </w:p>
         </w:tc>
@@ -2084,55 +1196,12 @@
                 <w:bCs/>
               </w:rPr>
             </w:pPr>
-            <w:proofErr w:type="spellStart"/>
-            <w:proofErr w:type="gramStart"/>
             <w:r>
               <w:rPr>
                 <w:b/>
                 <w:bCs/>
               </w:rPr>
-              <w:t>updateProfileData</w:t>
-            </w:r>
-            <w:proofErr w:type="spellEnd"/>
-            <w:r>
-              <w:rPr>
-                <w:b/>
-                <w:bCs/>
-              </w:rPr>
-              <w:t>(</w:t>
-            </w:r>
-            <w:proofErr w:type="gramEnd"/>
-            <w:r>
-              <w:rPr>
-                <w:b/>
-                <w:bCs/>
-              </w:rPr>
-              <w:t xml:space="preserve">) &amp; </w:t>
-            </w:r>
-            <w:proofErr w:type="spellStart"/>
-            <w:proofErr w:type="gramStart"/>
-            <w:r>
-              <w:rPr>
-                <w:b/>
-                <w:bCs/>
-              </w:rPr>
-              <w:t>updateAvatarUrl</w:t>
-            </w:r>
-            <w:proofErr w:type="spellEnd"/>
-            <w:r>
-              <w:rPr>
-                <w:b/>
-                <w:bCs/>
-              </w:rPr>
-              <w:t>(</w:t>
-            </w:r>
-            <w:proofErr w:type="gramEnd"/>
-            <w:r>
-              <w:rPr>
-                <w:b/>
-                <w:bCs/>
-              </w:rPr>
-              <w:t>)</w:t>
+              <w:t>registerUser()</w:t>
             </w:r>
           </w:p>
         </w:tc>
@@ -2171,7 +1240,7 @@
                 <w:b/>
                 <w:bCs/>
               </w:rPr>
-              <w:t>Cryptographic Predictability</w:t>
+              <w:t>IDOR (Profile Overwrites)</w:t>
             </w:r>
           </w:p>
         </w:tc>
@@ -2205,41 +1274,7 @@
                 <w:b/>
                 <w:bCs/>
               </w:rPr>
-              <w:t>Swapped pseudo-random generators (</w:t>
-            </w:r>
-            <w:proofErr w:type="spellStart"/>
-            <w:r>
-              <w:rPr>
-                <w:b/>
-                <w:bCs/>
-              </w:rPr>
-              <w:t>Math.random</w:t>
-            </w:r>
-            <w:proofErr w:type="spellEnd"/>
-            <w:r>
-              <w:rPr>
-                <w:b/>
-                <w:bCs/>
-              </w:rPr>
-              <w:t>()) for Node's native CSPRNG (</w:t>
-            </w:r>
-            <w:proofErr w:type="spellStart"/>
-            <w:proofErr w:type="gramStart"/>
-            <w:r>
-              <w:rPr>
-                <w:b/>
-                <w:bCs/>
-              </w:rPr>
-              <w:t>crypto.randomInt</w:t>
-            </w:r>
-            <w:proofErr w:type="spellEnd"/>
-            <w:proofErr w:type="gramEnd"/>
-            <w:r>
-              <w:rPr>
-                <w:b/>
-                <w:bCs/>
-              </w:rPr>
-              <w:t>) to ensure mathematically unpredictable OTP tokens.</w:t>
+              <w:t xml:space="preserve">Ignores client-supplied payload IDs. Database writes map exclusively to the ID authenticated via getServerSession. </w:t>
             </w:r>
           </w:p>
         </w:tc>
@@ -2273,267 +1308,7 @@
                 <w:b/>
                 <w:bCs/>
               </w:rPr>
-              <w:t xml:space="preserve">All token generation in </w:t>
-            </w:r>
-            <w:proofErr w:type="spellStart"/>
-            <w:r>
-              <w:rPr>
-                <w:b/>
-                <w:bCs/>
-              </w:rPr>
-              <w:t>auth.ts</w:t>
-            </w:r>
-            <w:proofErr w:type="spellEnd"/>
-          </w:p>
-        </w:tc>
-      </w:tr>
-      <w:tr>
-        <w:trPr>
-          <w:tblCellSpacing w:w="15" w:type="dxa"/>
-        </w:trPr>
-        <w:tc>
-          <w:tcPr>
-            <w:tcW w:w="0" w:type="auto"/>
-            <w:tcBorders>
-              <w:top w:val="single" w:sz="6" w:space="0" w:color="C4C7C5"/>
-              <w:left w:val="single" w:sz="6" w:space="0" w:color="C4C7C5"/>
-              <w:bottom w:val="single" w:sz="6" w:space="0" w:color="C4C7C5"/>
-              <w:right w:val="single" w:sz="6" w:space="0" w:color="C4C7C5"/>
-            </w:tcBorders>
-            <w:tcMar>
-              <w:top w:w="120" w:type="dxa"/>
-              <w:left w:w="180" w:type="dxa"/>
-              <w:bottom w:w="120" w:type="dxa"/>
-              <w:right w:w="180" w:type="dxa"/>
-            </w:tcMar>
-            <w:vAlign w:val="center"/>
-            <w:hideMark/>
-          </w:tcPr>
-          <w:p>
-            <w:pPr>
-              <w:rPr>
-                <w:b/>
-                <w:bCs/>
-              </w:rPr>
-            </w:pPr>
-            <w:r>
-              <w:rPr>
-                <w:b/>
-                <w:bCs/>
-              </w:rPr>
-              <w:lastRenderedPageBreak/>
-              <w:t>JWT Data Leakage &amp; Forgery</w:t>
-            </w:r>
-          </w:p>
-        </w:tc>
-        <w:tc>
-          <w:tcPr>
-            <w:tcW w:w="0" w:type="auto"/>
-            <w:tcBorders>
-              <w:top w:val="single" w:sz="6" w:space="0" w:color="C4C7C5"/>
-              <w:left w:val="single" w:sz="6" w:space="0" w:color="C4C7C5"/>
-              <w:bottom w:val="single" w:sz="6" w:space="0" w:color="C4C7C5"/>
-              <w:right w:val="single" w:sz="6" w:space="0" w:color="C4C7C5"/>
-            </w:tcBorders>
-            <w:tcMar>
-              <w:top w:w="120" w:type="dxa"/>
-              <w:left w:w="180" w:type="dxa"/>
-              <w:bottom w:w="120" w:type="dxa"/>
-              <w:right w:w="180" w:type="dxa"/>
-            </w:tcMar>
-            <w:vAlign w:val="center"/>
-            <w:hideMark/>
-          </w:tcPr>
-          <w:p>
-            <w:pPr>
-              <w:rPr>
-                <w:b/>
-                <w:bCs/>
-              </w:rPr>
-            </w:pPr>
-            <w:r>
-              <w:rPr>
-                <w:b/>
-                <w:bCs/>
-              </w:rPr>
-              <w:t xml:space="preserve">Boot-time environment guards crash the app if NEXTAUTH_SECRET is missing (preventing fallback exploits). Database queries enforce </w:t>
-            </w:r>
-            <w:proofErr w:type="gramStart"/>
-            <w:r>
-              <w:rPr>
-                <w:b/>
-                <w:bCs/>
-              </w:rPr>
-              <w:t>strict .select</w:t>
-            </w:r>
-            <w:proofErr w:type="gramEnd"/>
-            <w:r>
-              <w:rPr>
-                <w:b/>
-                <w:bCs/>
-              </w:rPr>
-              <w:t>() scoping to keep hashes out of JWT memory.</w:t>
-            </w:r>
-          </w:p>
-        </w:tc>
-        <w:tc>
-          <w:tcPr>
-            <w:tcW w:w="0" w:type="auto"/>
-            <w:tcBorders>
-              <w:top w:val="single" w:sz="6" w:space="0" w:color="C4C7C5"/>
-              <w:left w:val="single" w:sz="6" w:space="0" w:color="C4C7C5"/>
-              <w:bottom w:val="single" w:sz="6" w:space="0" w:color="C4C7C5"/>
-              <w:right w:val="single" w:sz="6" w:space="0" w:color="C4C7C5"/>
-            </w:tcBorders>
-            <w:tcMar>
-              <w:top w:w="120" w:type="dxa"/>
-              <w:left w:w="180" w:type="dxa"/>
-              <w:bottom w:w="120" w:type="dxa"/>
-              <w:right w:w="180" w:type="dxa"/>
-            </w:tcMar>
-            <w:vAlign w:val="center"/>
-            <w:hideMark/>
-          </w:tcPr>
-          <w:p>
-            <w:pPr>
-              <w:rPr>
-                <w:b/>
-                <w:bCs/>
-              </w:rPr>
-            </w:pPr>
-            <w:proofErr w:type="spellStart"/>
-            <w:r>
-              <w:rPr>
-                <w:b/>
-                <w:bCs/>
-              </w:rPr>
-              <w:t>route.tsx</w:t>
-            </w:r>
-            <w:proofErr w:type="spellEnd"/>
-          </w:p>
-        </w:tc>
-      </w:tr>
-      <w:tr>
-        <w:trPr>
-          <w:tblCellSpacing w:w="15" w:type="dxa"/>
-        </w:trPr>
-        <w:tc>
-          <w:tcPr>
-            <w:tcW w:w="0" w:type="auto"/>
-            <w:tcBorders>
-              <w:top w:val="single" w:sz="6" w:space="0" w:color="C4C7C5"/>
-              <w:left w:val="single" w:sz="6" w:space="0" w:color="C4C7C5"/>
-              <w:bottom w:val="single" w:sz="6" w:space="0" w:color="C4C7C5"/>
-              <w:right w:val="single" w:sz="6" w:space="0" w:color="C4C7C5"/>
-            </w:tcBorders>
-            <w:tcMar>
-              <w:top w:w="120" w:type="dxa"/>
-              <w:left w:w="180" w:type="dxa"/>
-              <w:bottom w:w="120" w:type="dxa"/>
-              <w:right w:w="180" w:type="dxa"/>
-            </w:tcMar>
-            <w:vAlign w:val="center"/>
-            <w:hideMark/>
-          </w:tcPr>
-          <w:p>
-            <w:pPr>
-              <w:rPr>
-                <w:b/>
-                <w:bCs/>
-              </w:rPr>
-            </w:pPr>
-            <w:r>
-              <w:rPr>
-                <w:b/>
-                <w:bCs/>
-              </w:rPr>
-              <w:t>User Enumeration</w:t>
-            </w:r>
-          </w:p>
-        </w:tc>
-        <w:tc>
-          <w:tcPr>
-            <w:tcW w:w="0" w:type="auto"/>
-            <w:tcBorders>
-              <w:top w:val="single" w:sz="6" w:space="0" w:color="C4C7C5"/>
-              <w:left w:val="single" w:sz="6" w:space="0" w:color="C4C7C5"/>
-              <w:bottom w:val="single" w:sz="6" w:space="0" w:color="C4C7C5"/>
-              <w:right w:val="single" w:sz="6" w:space="0" w:color="C4C7C5"/>
-            </w:tcBorders>
-            <w:tcMar>
-              <w:top w:w="120" w:type="dxa"/>
-              <w:left w:w="180" w:type="dxa"/>
-              <w:bottom w:w="120" w:type="dxa"/>
-              <w:right w:w="180" w:type="dxa"/>
-            </w:tcMar>
-            <w:vAlign w:val="center"/>
-            <w:hideMark/>
-          </w:tcPr>
-          <w:p>
-            <w:pPr>
-              <w:rPr>
-                <w:b/>
-                <w:bCs/>
-              </w:rPr>
-            </w:pPr>
-            <w:r>
-              <w:rPr>
-                <w:b/>
-                <w:bCs/>
-              </w:rPr>
-              <w:t>Blind success returns on password reset requests regardless of whether the email exists in the database.</w:t>
-            </w:r>
-          </w:p>
-        </w:tc>
-        <w:tc>
-          <w:tcPr>
-            <w:tcW w:w="0" w:type="auto"/>
-            <w:tcBorders>
-              <w:top w:val="single" w:sz="6" w:space="0" w:color="C4C7C5"/>
-              <w:left w:val="single" w:sz="6" w:space="0" w:color="C4C7C5"/>
-              <w:bottom w:val="single" w:sz="6" w:space="0" w:color="C4C7C5"/>
-              <w:right w:val="single" w:sz="6" w:space="0" w:color="C4C7C5"/>
-            </w:tcBorders>
-            <w:tcMar>
-              <w:top w:w="120" w:type="dxa"/>
-              <w:left w:w="180" w:type="dxa"/>
-              <w:bottom w:w="120" w:type="dxa"/>
-              <w:right w:w="180" w:type="dxa"/>
-            </w:tcMar>
-            <w:vAlign w:val="center"/>
-            <w:hideMark/>
-          </w:tcPr>
-          <w:p>
-            <w:pPr>
-              <w:rPr>
-                <w:b/>
-                <w:bCs/>
-              </w:rPr>
-            </w:pPr>
-            <w:proofErr w:type="spellStart"/>
-            <w:proofErr w:type="gramStart"/>
-            <w:r>
-              <w:rPr>
-                <w:b/>
-                <w:bCs/>
-              </w:rPr>
-              <w:t>requestPasswordReset</w:t>
-            </w:r>
-            <w:proofErr w:type="spellEnd"/>
-            <w:r>
-              <w:rPr>
-                <w:b/>
-                <w:bCs/>
-              </w:rPr>
-              <w:t>(</w:t>
-            </w:r>
-            <w:proofErr w:type="gramEnd"/>
-            <w:r>
-              <w:rPr>
-                <w:b/>
-                <w:bCs/>
-              </w:rPr>
-              <w:t>)</w:t>
+              <w:t>app/actions/profile.ts</w:t>
             </w:r>
           </w:p>
         </w:tc>
@@ -2572,7 +1347,7 @@
                 <w:b/>
                 <w:bCs/>
               </w:rPr>
-              <w:t>Replay Attacks</w:t>
+              <w:t>Cryptographic Predictability</w:t>
             </w:r>
           </w:p>
         </w:tc>
@@ -2606,39 +1381,7 @@
                 <w:b/>
                 <w:bCs/>
               </w:rPr>
-              <w:t xml:space="preserve">Immediate destruction (NULL assignment) of </w:t>
-            </w:r>
-            <w:proofErr w:type="spellStart"/>
-            <w:r>
-              <w:rPr>
-                <w:b/>
-                <w:bCs/>
-              </w:rPr>
-              <w:t>verification_token</w:t>
-            </w:r>
-            <w:proofErr w:type="spellEnd"/>
-            <w:r>
-              <w:rPr>
-                <w:b/>
-                <w:bCs/>
-              </w:rPr>
-              <w:t xml:space="preserve"> and </w:t>
-            </w:r>
-            <w:proofErr w:type="spellStart"/>
-            <w:r>
-              <w:rPr>
-                <w:b/>
-                <w:bCs/>
-              </w:rPr>
-              <w:t>token_expiry</w:t>
-            </w:r>
-            <w:proofErr w:type="spellEnd"/>
-            <w:r>
-              <w:rPr>
-                <w:b/>
-                <w:bCs/>
-              </w:rPr>
-              <w:t xml:space="preserve"> upon successful consumption.</w:t>
+              <w:t xml:space="preserve">Native CSPRNG (crypto.randomInt) ensures mathematically unpredictable 6-digit OTP tokens. </w:t>
             </w:r>
           </w:p>
         </w:tc>
@@ -2667,55 +1410,12 @@
                 <w:bCs/>
               </w:rPr>
             </w:pPr>
-            <w:proofErr w:type="spellStart"/>
-            <w:proofErr w:type="gramStart"/>
             <w:r>
               <w:rPr>
                 <w:b/>
                 <w:bCs/>
               </w:rPr>
-              <w:t>verifyUserEmail</w:t>
-            </w:r>
-            <w:proofErr w:type="spellEnd"/>
-            <w:r>
-              <w:rPr>
-                <w:b/>
-                <w:bCs/>
-              </w:rPr>
-              <w:t>(</w:t>
-            </w:r>
-            <w:proofErr w:type="gramEnd"/>
-            <w:r>
-              <w:rPr>
-                <w:b/>
-                <w:bCs/>
-              </w:rPr>
-              <w:t xml:space="preserve">) &amp; </w:t>
-            </w:r>
-            <w:proofErr w:type="spellStart"/>
-            <w:proofErr w:type="gramStart"/>
-            <w:r>
-              <w:rPr>
-                <w:b/>
-                <w:bCs/>
-              </w:rPr>
-              <w:t>resetPassword</w:t>
-            </w:r>
-            <w:proofErr w:type="spellEnd"/>
-            <w:r>
-              <w:rPr>
-                <w:b/>
-                <w:bCs/>
-              </w:rPr>
-              <w:t>(</w:t>
-            </w:r>
-            <w:proofErr w:type="gramEnd"/>
-            <w:r>
-              <w:rPr>
-                <w:b/>
-                <w:bCs/>
-              </w:rPr>
-              <w:t>)</w:t>
+              <w:t>All token generation in auth.ts</w:t>
             </w:r>
           </w:p>
         </w:tc>
@@ -2754,7 +1454,7 @@
                 <w:b/>
                 <w:bCs/>
               </w:rPr>
-              <w:t>Password Reuse</w:t>
+              <w:t>JWT Data Leakage &amp; Forgery</w:t>
             </w:r>
           </w:p>
         </w:tc>
@@ -2788,25 +1488,7 @@
                 <w:b/>
                 <w:bCs/>
               </w:rPr>
-              <w:t xml:space="preserve">Cryptographic hash comparison against historical records using </w:t>
-            </w:r>
-            <w:proofErr w:type="spellStart"/>
-            <w:proofErr w:type="gramStart"/>
-            <w:r>
-              <w:rPr>
-                <w:b/>
-                <w:bCs/>
-              </w:rPr>
-              <w:t>bcrypt.compare</w:t>
-            </w:r>
-            <w:proofErr w:type="spellEnd"/>
-            <w:proofErr w:type="gramEnd"/>
-            <w:r>
-              <w:rPr>
-                <w:b/>
-                <w:bCs/>
-              </w:rPr>
-              <w:t>.</w:t>
+              <w:t xml:space="preserve">Boot-time environment guards crash the app if NEXTAUTH_SECRET is missing. Database queries enforce strict .select() scoping to keep hashes out of JWT memory. </w:t>
             </w:r>
           </w:p>
         </w:tc>
@@ -2835,30 +1517,12 @@
                 <w:bCs/>
               </w:rPr>
             </w:pPr>
-            <w:proofErr w:type="spellStart"/>
-            <w:proofErr w:type="gramStart"/>
             <w:r>
               <w:rPr>
                 <w:b/>
                 <w:bCs/>
               </w:rPr>
-              <w:t>resetPassword</w:t>
-            </w:r>
-            <w:proofErr w:type="spellEnd"/>
-            <w:r>
-              <w:rPr>
-                <w:b/>
-                <w:bCs/>
-              </w:rPr>
-              <w:t>(</w:t>
-            </w:r>
-            <w:proofErr w:type="gramEnd"/>
-            <w:r>
-              <w:rPr>
-                <w:b/>
-                <w:bCs/>
-              </w:rPr>
-              <w:t>)</w:t>
+              <w:t>app/api/auth/[...nextauth]/route.tsx</w:t>
             </w:r>
           </w:p>
         </w:tc>
@@ -2897,6 +1561,336 @@
                 <w:b/>
                 <w:bCs/>
               </w:rPr>
+              <w:t>User Enumeration</w:t>
+            </w:r>
+          </w:p>
+        </w:tc>
+        <w:tc>
+          <w:tcPr>
+            <w:tcW w:w="0" w:type="auto"/>
+            <w:tcBorders>
+              <w:top w:val="single" w:sz="6" w:space="0" w:color="C4C7C5"/>
+              <w:left w:val="single" w:sz="6" w:space="0" w:color="C4C7C5"/>
+              <w:bottom w:val="single" w:sz="6" w:space="0" w:color="C4C7C5"/>
+              <w:right w:val="single" w:sz="6" w:space="0" w:color="C4C7C5"/>
+            </w:tcBorders>
+            <w:tcMar>
+              <w:top w:w="120" w:type="dxa"/>
+              <w:left w:w="180" w:type="dxa"/>
+              <w:bottom w:w="120" w:type="dxa"/>
+              <w:right w:w="180" w:type="dxa"/>
+            </w:tcMar>
+            <w:vAlign w:val="center"/>
+            <w:hideMark/>
+          </w:tcPr>
+          <w:p>
+            <w:pPr>
+              <w:rPr>
+                <w:b/>
+                <w:bCs/>
+              </w:rPr>
+            </w:pPr>
+            <w:r>
+              <w:rPr>
+                <w:b/>
+                <w:bCs/>
+              </w:rPr>
+              <w:t xml:space="preserve">Blind success returns on password reset requests regardless of whether the </w:t>
+            </w:r>
+            <w:r>
+              <w:rPr>
+                <w:b/>
+                <w:bCs/>
+              </w:rPr>
+              <w:lastRenderedPageBreak/>
+              <w:t xml:space="preserve">email exists in the database. Generic rejection messages on login. </w:t>
+            </w:r>
+          </w:p>
+        </w:tc>
+        <w:tc>
+          <w:tcPr>
+            <w:tcW w:w="0" w:type="auto"/>
+            <w:tcBorders>
+              <w:top w:val="single" w:sz="6" w:space="0" w:color="C4C7C5"/>
+              <w:left w:val="single" w:sz="6" w:space="0" w:color="C4C7C5"/>
+              <w:bottom w:val="single" w:sz="6" w:space="0" w:color="C4C7C5"/>
+              <w:right w:val="single" w:sz="6" w:space="0" w:color="C4C7C5"/>
+            </w:tcBorders>
+            <w:tcMar>
+              <w:top w:w="120" w:type="dxa"/>
+              <w:left w:w="180" w:type="dxa"/>
+              <w:bottom w:w="120" w:type="dxa"/>
+              <w:right w:w="180" w:type="dxa"/>
+            </w:tcMar>
+            <w:vAlign w:val="center"/>
+            <w:hideMark/>
+          </w:tcPr>
+          <w:p>
+            <w:pPr>
+              <w:rPr>
+                <w:b/>
+                <w:bCs/>
+              </w:rPr>
+            </w:pPr>
+            <w:r>
+              <w:rPr>
+                <w:b/>
+                <w:bCs/>
+              </w:rPr>
+              <w:lastRenderedPageBreak/>
+              <w:t>requestPasswordReset() &amp; route.tsx</w:t>
+            </w:r>
+          </w:p>
+        </w:tc>
+      </w:tr>
+      <w:tr>
+        <w:trPr>
+          <w:tblCellSpacing w:w="15" w:type="dxa"/>
+        </w:trPr>
+        <w:tc>
+          <w:tcPr>
+            <w:tcW w:w="0" w:type="auto"/>
+            <w:tcBorders>
+              <w:top w:val="single" w:sz="6" w:space="0" w:color="C4C7C5"/>
+              <w:left w:val="single" w:sz="6" w:space="0" w:color="C4C7C5"/>
+              <w:bottom w:val="single" w:sz="6" w:space="0" w:color="C4C7C5"/>
+              <w:right w:val="single" w:sz="6" w:space="0" w:color="C4C7C5"/>
+            </w:tcBorders>
+            <w:tcMar>
+              <w:top w:w="120" w:type="dxa"/>
+              <w:left w:w="180" w:type="dxa"/>
+              <w:bottom w:w="120" w:type="dxa"/>
+              <w:right w:w="180" w:type="dxa"/>
+            </w:tcMar>
+            <w:vAlign w:val="center"/>
+            <w:hideMark/>
+          </w:tcPr>
+          <w:p>
+            <w:pPr>
+              <w:rPr>
+                <w:b/>
+                <w:bCs/>
+              </w:rPr>
+            </w:pPr>
+            <w:r>
+              <w:rPr>
+                <w:b/>
+                <w:bCs/>
+              </w:rPr>
+              <w:t>Replay Attacks</w:t>
+            </w:r>
+          </w:p>
+        </w:tc>
+        <w:tc>
+          <w:tcPr>
+            <w:tcW w:w="0" w:type="auto"/>
+            <w:tcBorders>
+              <w:top w:val="single" w:sz="6" w:space="0" w:color="C4C7C5"/>
+              <w:left w:val="single" w:sz="6" w:space="0" w:color="C4C7C5"/>
+              <w:bottom w:val="single" w:sz="6" w:space="0" w:color="C4C7C5"/>
+              <w:right w:val="single" w:sz="6" w:space="0" w:color="C4C7C5"/>
+            </w:tcBorders>
+            <w:tcMar>
+              <w:top w:w="120" w:type="dxa"/>
+              <w:left w:w="180" w:type="dxa"/>
+              <w:bottom w:w="120" w:type="dxa"/>
+              <w:right w:w="180" w:type="dxa"/>
+            </w:tcMar>
+            <w:vAlign w:val="center"/>
+            <w:hideMark/>
+          </w:tcPr>
+          <w:p>
+            <w:pPr>
+              <w:rPr>
+                <w:b/>
+                <w:bCs/>
+              </w:rPr>
+            </w:pPr>
+            <w:r>
+              <w:rPr>
+                <w:b/>
+                <w:bCs/>
+              </w:rPr>
+              <w:t xml:space="preserve">Immediate destruction (NULL assignment) of verification_token and token_expiry upon successful consumption. </w:t>
+            </w:r>
+          </w:p>
+        </w:tc>
+        <w:tc>
+          <w:tcPr>
+            <w:tcW w:w="0" w:type="auto"/>
+            <w:tcBorders>
+              <w:top w:val="single" w:sz="6" w:space="0" w:color="C4C7C5"/>
+              <w:left w:val="single" w:sz="6" w:space="0" w:color="C4C7C5"/>
+              <w:bottom w:val="single" w:sz="6" w:space="0" w:color="C4C7C5"/>
+              <w:right w:val="single" w:sz="6" w:space="0" w:color="C4C7C5"/>
+            </w:tcBorders>
+            <w:tcMar>
+              <w:top w:w="120" w:type="dxa"/>
+              <w:left w:w="180" w:type="dxa"/>
+              <w:bottom w:w="120" w:type="dxa"/>
+              <w:right w:w="180" w:type="dxa"/>
+            </w:tcMar>
+            <w:vAlign w:val="center"/>
+            <w:hideMark/>
+          </w:tcPr>
+          <w:p>
+            <w:pPr>
+              <w:rPr>
+                <w:b/>
+                <w:bCs/>
+              </w:rPr>
+            </w:pPr>
+            <w:r>
+              <w:rPr>
+                <w:b/>
+                <w:bCs/>
+              </w:rPr>
+              <w:t>verifyUserEmail() &amp; resetPassword()</w:t>
+            </w:r>
+          </w:p>
+        </w:tc>
+      </w:tr>
+      <w:tr>
+        <w:trPr>
+          <w:tblCellSpacing w:w="15" w:type="dxa"/>
+        </w:trPr>
+        <w:tc>
+          <w:tcPr>
+            <w:tcW w:w="0" w:type="auto"/>
+            <w:tcBorders>
+              <w:top w:val="single" w:sz="6" w:space="0" w:color="C4C7C5"/>
+              <w:left w:val="single" w:sz="6" w:space="0" w:color="C4C7C5"/>
+              <w:bottom w:val="single" w:sz="6" w:space="0" w:color="C4C7C5"/>
+              <w:right w:val="single" w:sz="6" w:space="0" w:color="C4C7C5"/>
+            </w:tcBorders>
+            <w:tcMar>
+              <w:top w:w="120" w:type="dxa"/>
+              <w:left w:w="180" w:type="dxa"/>
+              <w:bottom w:w="120" w:type="dxa"/>
+              <w:right w:w="180" w:type="dxa"/>
+            </w:tcMar>
+            <w:vAlign w:val="center"/>
+            <w:hideMark/>
+          </w:tcPr>
+          <w:p>
+            <w:pPr>
+              <w:rPr>
+                <w:b/>
+                <w:bCs/>
+              </w:rPr>
+            </w:pPr>
+            <w:r>
+              <w:rPr>
+                <w:b/>
+                <w:bCs/>
+              </w:rPr>
+              <w:t>Password Reuse</w:t>
+            </w:r>
+          </w:p>
+        </w:tc>
+        <w:tc>
+          <w:tcPr>
+            <w:tcW w:w="0" w:type="auto"/>
+            <w:tcBorders>
+              <w:top w:val="single" w:sz="6" w:space="0" w:color="C4C7C5"/>
+              <w:left w:val="single" w:sz="6" w:space="0" w:color="C4C7C5"/>
+              <w:bottom w:val="single" w:sz="6" w:space="0" w:color="C4C7C5"/>
+              <w:right w:val="single" w:sz="6" w:space="0" w:color="C4C7C5"/>
+            </w:tcBorders>
+            <w:tcMar>
+              <w:top w:w="120" w:type="dxa"/>
+              <w:left w:w="180" w:type="dxa"/>
+              <w:bottom w:w="120" w:type="dxa"/>
+              <w:right w:w="180" w:type="dxa"/>
+            </w:tcMar>
+            <w:vAlign w:val="center"/>
+            <w:hideMark/>
+          </w:tcPr>
+          <w:p>
+            <w:pPr>
+              <w:rPr>
+                <w:b/>
+                <w:bCs/>
+              </w:rPr>
+            </w:pPr>
+            <w:r>
+              <w:rPr>
+                <w:b/>
+                <w:bCs/>
+              </w:rPr>
+              <w:t xml:space="preserve">Cryptographic hash comparison against historical records using bcrypt.compare. </w:t>
+            </w:r>
+          </w:p>
+        </w:tc>
+        <w:tc>
+          <w:tcPr>
+            <w:tcW w:w="0" w:type="auto"/>
+            <w:tcBorders>
+              <w:top w:val="single" w:sz="6" w:space="0" w:color="C4C7C5"/>
+              <w:left w:val="single" w:sz="6" w:space="0" w:color="C4C7C5"/>
+              <w:bottom w:val="single" w:sz="6" w:space="0" w:color="C4C7C5"/>
+              <w:right w:val="single" w:sz="6" w:space="0" w:color="C4C7C5"/>
+            </w:tcBorders>
+            <w:tcMar>
+              <w:top w:w="120" w:type="dxa"/>
+              <w:left w:w="180" w:type="dxa"/>
+              <w:bottom w:w="120" w:type="dxa"/>
+              <w:right w:w="180" w:type="dxa"/>
+            </w:tcMar>
+            <w:vAlign w:val="center"/>
+            <w:hideMark/>
+          </w:tcPr>
+          <w:p>
+            <w:pPr>
+              <w:rPr>
+                <w:b/>
+                <w:bCs/>
+              </w:rPr>
+            </w:pPr>
+            <w:r>
+              <w:rPr>
+                <w:b/>
+                <w:bCs/>
+              </w:rPr>
+              <w:t>resetPassword()</w:t>
+            </w:r>
+          </w:p>
+        </w:tc>
+      </w:tr>
+      <w:tr>
+        <w:trPr>
+          <w:tblCellSpacing w:w="15" w:type="dxa"/>
+        </w:trPr>
+        <w:tc>
+          <w:tcPr>
+            <w:tcW w:w="0" w:type="auto"/>
+            <w:tcBorders>
+              <w:top w:val="single" w:sz="6" w:space="0" w:color="C4C7C5"/>
+              <w:left w:val="single" w:sz="6" w:space="0" w:color="C4C7C5"/>
+              <w:bottom w:val="single" w:sz="6" w:space="0" w:color="C4C7C5"/>
+              <w:right w:val="single" w:sz="6" w:space="0" w:color="C4C7C5"/>
+            </w:tcBorders>
+            <w:tcMar>
+              <w:top w:w="120" w:type="dxa"/>
+              <w:left w:w="180" w:type="dxa"/>
+              <w:bottom w:w="120" w:type="dxa"/>
+              <w:right w:w="180" w:type="dxa"/>
+            </w:tcMar>
+            <w:vAlign w:val="center"/>
+            <w:hideMark/>
+          </w:tcPr>
+          <w:p>
+            <w:pPr>
+              <w:rPr>
+                <w:b/>
+                <w:bCs/>
+              </w:rPr>
+            </w:pPr>
+            <w:r>
+              <w:rPr>
+                <w:b/>
+                <w:bCs/>
+              </w:rPr>
               <w:t>SQL Injection</w:t>
             </w:r>
           </w:p>
@@ -2931,23 +1925,7 @@
                 <w:b/>
                 <w:bCs/>
               </w:rPr>
-              <w:t xml:space="preserve">Parameterized query execution via the </w:t>
-            </w:r>
-            <w:proofErr w:type="gramStart"/>
-            <w:r>
-              <w:rPr>
-                <w:b/>
-                <w:bCs/>
-              </w:rPr>
-              <w:t>official @</w:t>
-            </w:r>
-            <w:proofErr w:type="gramEnd"/>
-            <w:r>
-              <w:rPr>
-                <w:b/>
-                <w:bCs/>
-              </w:rPr>
-              <w:t>supabase/supabase-js abstraction layer.</w:t>
+              <w:t xml:space="preserve">Parameterized query execution via the official @supabase/supabase-js abstraction layer. </w:t>
             </w:r>
           </w:p>
         </w:tc>
@@ -2981,33 +1959,115 @@
                 <w:b/>
                 <w:bCs/>
               </w:rPr>
-              <w:t xml:space="preserve">All database calls across </w:t>
+              <w:t xml:space="preserve">All database calls </w:t>
             </w:r>
-            <w:proofErr w:type="spellStart"/>
+          </w:p>
+        </w:tc>
+      </w:tr>
+      <w:tr>
+        <w:trPr>
+          <w:tblCellSpacing w:w="15" w:type="dxa"/>
+        </w:trPr>
+        <w:tc>
+          <w:tcPr>
+            <w:tcW w:w="0" w:type="auto"/>
+            <w:tcBorders>
+              <w:top w:val="single" w:sz="6" w:space="0" w:color="C4C7C5"/>
+              <w:left w:val="single" w:sz="6" w:space="0" w:color="C4C7C5"/>
+              <w:bottom w:val="single" w:sz="6" w:space="0" w:color="C4C7C5"/>
+              <w:right w:val="single" w:sz="6" w:space="0" w:color="C4C7C5"/>
+            </w:tcBorders>
+            <w:tcMar>
+              <w:top w:w="120" w:type="dxa"/>
+              <w:left w:w="180" w:type="dxa"/>
+              <w:bottom w:w="120" w:type="dxa"/>
+              <w:right w:w="180" w:type="dxa"/>
+            </w:tcMar>
+            <w:vAlign w:val="center"/>
+            <w:hideMark/>
+          </w:tcPr>
+          <w:p>
+            <w:pPr>
+              <w:rPr>
+                <w:b/>
+                <w:bCs/>
+              </w:rPr>
+            </w:pPr>
             <w:r>
               <w:rPr>
                 <w:b/>
                 <w:bCs/>
               </w:rPr>
-              <w:t>auth.ts</w:t>
+              <w:t>Username Squatting/Spam</w:t>
             </w:r>
-            <w:proofErr w:type="spellEnd"/>
+          </w:p>
+        </w:tc>
+        <w:tc>
+          <w:tcPr>
+            <w:tcW w:w="0" w:type="auto"/>
+            <w:tcBorders>
+              <w:top w:val="single" w:sz="6" w:space="0" w:color="C4C7C5"/>
+              <w:left w:val="single" w:sz="6" w:space="0" w:color="C4C7C5"/>
+              <w:bottom w:val="single" w:sz="6" w:space="0" w:color="C4C7C5"/>
+              <w:right w:val="single" w:sz="6" w:space="0" w:color="C4C7C5"/>
+            </w:tcBorders>
+            <w:tcMar>
+              <w:top w:w="120" w:type="dxa"/>
+              <w:left w:w="180" w:type="dxa"/>
+              <w:bottom w:w="120" w:type="dxa"/>
+              <w:right w:w="180" w:type="dxa"/>
+            </w:tcMar>
+            <w:vAlign w:val="center"/>
+            <w:hideMark/>
+          </w:tcPr>
+          <w:p>
+            <w:pPr>
+              <w:rPr>
+                <w:b/>
+                <w:bCs/>
+              </w:rPr>
+            </w:pPr>
             <w:r>
               <w:rPr>
                 <w:b/>
                 <w:bCs/>
               </w:rPr>
-              <w:t xml:space="preserve"> &amp; </w:t>
+              <w:t xml:space="preserve">Rate limiter enforcing a strict 30-day cooldown period between username changes. </w:t>
             </w:r>
-            <w:proofErr w:type="spellStart"/>
+          </w:p>
+        </w:tc>
+        <w:tc>
+          <w:tcPr>
+            <w:tcW w:w="0" w:type="auto"/>
+            <w:tcBorders>
+              <w:top w:val="single" w:sz="6" w:space="0" w:color="C4C7C5"/>
+              <w:left w:val="single" w:sz="6" w:space="0" w:color="C4C7C5"/>
+              <w:bottom w:val="single" w:sz="6" w:space="0" w:color="C4C7C5"/>
+              <w:right w:val="single" w:sz="6" w:space="0" w:color="C4C7C5"/>
+            </w:tcBorders>
+            <w:tcMar>
+              <w:top w:w="120" w:type="dxa"/>
+              <w:left w:w="180" w:type="dxa"/>
+              <w:bottom w:w="120" w:type="dxa"/>
+              <w:right w:w="180" w:type="dxa"/>
+            </w:tcMar>
+            <w:vAlign w:val="center"/>
+            <w:hideMark/>
+          </w:tcPr>
+          <w:p>
+            <w:pPr>
+              <w:rPr>
+                <w:b/>
+                <w:bCs/>
+              </w:rPr>
+            </w:pPr>
             <w:r>
               <w:rPr>
                 <w:b/>
                 <w:bCs/>
               </w:rPr>
-              <w:t>profile.ts</w:t>
+              <w:t>updateProfileData()</w:t>
             </w:r>
-            <w:proofErr w:type="spellEnd"/>
           </w:p>
         </w:tc>
       </w:tr>
@@ -3175,6 +2235,155 @@
     </w:lvl>
   </w:abstractNum>
   <w:abstractNum w:abstractNumId="1" w15:restartNumberingAfterBreak="0">
+    <w:nsid w:val="0B6437A7"/>
+    <w:multiLevelType w:val="multilevel"/>
+    <w:tmpl w:val="8F30C660"/>
+    <w:lvl w:ilvl="0">
+      <w:start w:val="1"/>
+      <w:numFmt w:val="bullet"/>
+      <w:lvlText w:val=""/>
+      <w:lvlJc w:val="left"/>
+      <w:pPr>
+        <w:tabs>
+          <w:tab w:val="num" w:pos="720"/>
+        </w:tabs>
+        <w:ind w:left="720" w:hanging="360"/>
+      </w:pPr>
+      <w:rPr>
+        <w:rFonts w:ascii="Symbol" w:hAnsi="Symbol" w:hint="default"/>
+        <w:sz w:val="20"/>
+      </w:rPr>
+    </w:lvl>
+    <w:lvl w:ilvl="1" w:tentative="1">
+      <w:start w:val="1"/>
+      <w:numFmt w:val="bullet"/>
+      <w:lvlText w:val="o"/>
+      <w:lvlJc w:val="left"/>
+      <w:pPr>
+        <w:tabs>
+          <w:tab w:val="num" w:pos="1440"/>
+        </w:tabs>
+        <w:ind w:left="1440" w:hanging="360"/>
+      </w:pPr>
+      <w:rPr>
+        <w:rFonts w:ascii="Courier New" w:hAnsi="Courier New" w:hint="default"/>
+        <w:sz w:val="20"/>
+      </w:rPr>
+    </w:lvl>
+    <w:lvl w:ilvl="2" w:tentative="1">
+      <w:start w:val="1"/>
+      <w:numFmt w:val="bullet"/>
+      <w:lvlText w:val=""/>
+      <w:lvlJc w:val="left"/>
+      <w:pPr>
+        <w:tabs>
+          <w:tab w:val="num" w:pos="2160"/>
+        </w:tabs>
+        <w:ind w:left="2160" w:hanging="360"/>
+      </w:pPr>
+      <w:rPr>
+        <w:rFonts w:ascii="Wingdings" w:hAnsi="Wingdings" w:hint="default"/>
+        <w:sz w:val="20"/>
+      </w:rPr>
+    </w:lvl>
+    <w:lvl w:ilvl="3" w:tentative="1">
+      <w:start w:val="1"/>
+      <w:numFmt w:val="bullet"/>
+      <w:lvlText w:val=""/>
+      <w:lvlJc w:val="left"/>
+      <w:pPr>
+        <w:tabs>
+          <w:tab w:val="num" w:pos="2880"/>
+        </w:tabs>
+        <w:ind w:left="2880" w:hanging="360"/>
+      </w:pPr>
+      <w:rPr>
+        <w:rFonts w:ascii="Wingdings" w:hAnsi="Wingdings" w:hint="default"/>
+        <w:sz w:val="20"/>
+      </w:rPr>
+    </w:lvl>
+    <w:lvl w:ilvl="4" w:tentative="1">
+      <w:start w:val="1"/>
+      <w:numFmt w:val="bullet"/>
+      <w:lvlText w:val=""/>
+      <w:lvlJc w:val="left"/>
+      <w:pPr>
+        <w:tabs>
+          <w:tab w:val="num" w:pos="3600"/>
+        </w:tabs>
+        <w:ind w:left="3600" w:hanging="360"/>
+      </w:pPr>
+      <w:rPr>
+        <w:rFonts w:ascii="Wingdings" w:hAnsi="Wingdings" w:hint="default"/>
+        <w:sz w:val="20"/>
+      </w:rPr>
+    </w:lvl>
+    <w:lvl w:ilvl="5" w:tentative="1">
+      <w:start w:val="1"/>
+      <w:numFmt w:val="bullet"/>
+      <w:lvlText w:val=""/>
+      <w:lvlJc w:val="left"/>
+      <w:pPr>
+        <w:tabs>
+          <w:tab w:val="num" w:pos="4320"/>
+        </w:tabs>
+        <w:ind w:left="4320" w:hanging="360"/>
+      </w:pPr>
+      <w:rPr>
+        <w:rFonts w:ascii="Wingdings" w:hAnsi="Wingdings" w:hint="default"/>
+        <w:sz w:val="20"/>
+      </w:rPr>
+    </w:lvl>
+    <w:lvl w:ilvl="6" w:tentative="1">
+      <w:start w:val="1"/>
+      <w:numFmt w:val="bullet"/>
+      <w:lvlText w:val=""/>
+      <w:lvlJc w:val="left"/>
+      <w:pPr>
+        <w:tabs>
+          <w:tab w:val="num" w:pos="5040"/>
+        </w:tabs>
+        <w:ind w:left="5040" w:hanging="360"/>
+      </w:pPr>
+      <w:rPr>
+        <w:rFonts w:ascii="Wingdings" w:hAnsi="Wingdings" w:hint="default"/>
+        <w:sz w:val="20"/>
+      </w:rPr>
+    </w:lvl>
+    <w:lvl w:ilvl="7" w:tentative="1">
+      <w:start w:val="1"/>
+      <w:numFmt w:val="bullet"/>
+      <w:lvlText w:val=""/>
+      <w:lvlJc w:val="left"/>
+      <w:pPr>
+        <w:tabs>
+          <w:tab w:val="num" w:pos="5760"/>
+        </w:tabs>
+        <w:ind w:left="5760" w:hanging="360"/>
+      </w:pPr>
+      <w:rPr>
+        <w:rFonts w:ascii="Wingdings" w:hAnsi="Wingdings" w:hint="default"/>
+        <w:sz w:val="20"/>
+      </w:rPr>
+    </w:lvl>
+    <w:lvl w:ilvl="8" w:tentative="1">
+      <w:start w:val="1"/>
+      <w:numFmt w:val="bullet"/>
+      <w:lvlText w:val=""/>
+      <w:lvlJc w:val="left"/>
+      <w:pPr>
+        <w:tabs>
+          <w:tab w:val="num" w:pos="6480"/>
+        </w:tabs>
+        <w:ind w:left="6480" w:hanging="360"/>
+      </w:pPr>
+      <w:rPr>
+        <w:rFonts w:ascii="Wingdings" w:hAnsi="Wingdings" w:hint="default"/>
+        <w:sz w:val="20"/>
+      </w:rPr>
+    </w:lvl>
+  </w:abstractNum>
+  <w:abstractNum w:abstractNumId="2" w15:restartNumberingAfterBreak="0">
     <w:nsid w:val="10E30125"/>
     <w:multiLevelType w:val="multilevel"/>
     <w:tmpl w:val="4A3EAA32"/>
@@ -3323,7 +2532,156 @@
       </w:rPr>
     </w:lvl>
   </w:abstractNum>
-  <w:abstractNum w:abstractNumId="2" w15:restartNumberingAfterBreak="0">
+  <w:abstractNum w:abstractNumId="3" w15:restartNumberingAfterBreak="0">
+    <w:nsid w:val="14AF313D"/>
+    <w:multiLevelType w:val="multilevel"/>
+    <w:tmpl w:val="6F129EC2"/>
+    <w:lvl w:ilvl="0">
+      <w:start w:val="1"/>
+      <w:numFmt w:val="bullet"/>
+      <w:lvlText w:val=""/>
+      <w:lvlJc w:val="left"/>
+      <w:pPr>
+        <w:tabs>
+          <w:tab w:val="num" w:pos="720"/>
+        </w:tabs>
+        <w:ind w:left="720" w:hanging="360"/>
+      </w:pPr>
+      <w:rPr>
+        <w:rFonts w:ascii="Symbol" w:hAnsi="Symbol" w:hint="default"/>
+        <w:sz w:val="20"/>
+      </w:rPr>
+    </w:lvl>
+    <w:lvl w:ilvl="1" w:tentative="1">
+      <w:start w:val="1"/>
+      <w:numFmt w:val="bullet"/>
+      <w:lvlText w:val="o"/>
+      <w:lvlJc w:val="left"/>
+      <w:pPr>
+        <w:tabs>
+          <w:tab w:val="num" w:pos="1440"/>
+        </w:tabs>
+        <w:ind w:left="1440" w:hanging="360"/>
+      </w:pPr>
+      <w:rPr>
+        <w:rFonts w:ascii="Courier New" w:hAnsi="Courier New" w:hint="default"/>
+        <w:sz w:val="20"/>
+      </w:rPr>
+    </w:lvl>
+    <w:lvl w:ilvl="2" w:tentative="1">
+      <w:start w:val="1"/>
+      <w:numFmt w:val="bullet"/>
+      <w:lvlText w:val=""/>
+      <w:lvlJc w:val="left"/>
+      <w:pPr>
+        <w:tabs>
+          <w:tab w:val="num" w:pos="2160"/>
+        </w:tabs>
+        <w:ind w:left="2160" w:hanging="360"/>
+      </w:pPr>
+      <w:rPr>
+        <w:rFonts w:ascii="Wingdings" w:hAnsi="Wingdings" w:hint="default"/>
+        <w:sz w:val="20"/>
+      </w:rPr>
+    </w:lvl>
+    <w:lvl w:ilvl="3" w:tentative="1">
+      <w:start w:val="1"/>
+      <w:numFmt w:val="bullet"/>
+      <w:lvlText w:val=""/>
+      <w:lvlJc w:val="left"/>
+      <w:pPr>
+        <w:tabs>
+          <w:tab w:val="num" w:pos="2880"/>
+        </w:tabs>
+        <w:ind w:left="2880" w:hanging="360"/>
+      </w:pPr>
+      <w:rPr>
+        <w:rFonts w:ascii="Wingdings" w:hAnsi="Wingdings" w:hint="default"/>
+        <w:sz w:val="20"/>
+      </w:rPr>
+    </w:lvl>
+    <w:lvl w:ilvl="4" w:tentative="1">
+      <w:start w:val="1"/>
+      <w:numFmt w:val="bullet"/>
+      <w:lvlText w:val=""/>
+      <w:lvlJc w:val="left"/>
+      <w:pPr>
+        <w:tabs>
+          <w:tab w:val="num" w:pos="3600"/>
+        </w:tabs>
+        <w:ind w:left="3600" w:hanging="360"/>
+      </w:pPr>
+      <w:rPr>
+        <w:rFonts w:ascii="Wingdings" w:hAnsi="Wingdings" w:hint="default"/>
+        <w:sz w:val="20"/>
+      </w:rPr>
+    </w:lvl>
+    <w:lvl w:ilvl="5" w:tentative="1">
+      <w:start w:val="1"/>
+      <w:numFmt w:val="bullet"/>
+      <w:lvlText w:val=""/>
+      <w:lvlJc w:val="left"/>
+      <w:pPr>
+        <w:tabs>
+          <w:tab w:val="num" w:pos="4320"/>
+        </w:tabs>
+        <w:ind w:left="4320" w:hanging="360"/>
+      </w:pPr>
+      <w:rPr>
+        <w:rFonts w:ascii="Wingdings" w:hAnsi="Wingdings" w:hint="default"/>
+        <w:sz w:val="20"/>
+      </w:rPr>
+    </w:lvl>
+    <w:lvl w:ilvl="6" w:tentative="1">
+      <w:start w:val="1"/>
+      <w:numFmt w:val="bullet"/>
+      <w:lvlText w:val=""/>
+      <w:lvlJc w:val="left"/>
+      <w:pPr>
+        <w:tabs>
+          <w:tab w:val="num" w:pos="5040"/>
+        </w:tabs>
+        <w:ind w:left="5040" w:hanging="360"/>
+      </w:pPr>
+      <w:rPr>
+        <w:rFonts w:ascii="Wingdings" w:hAnsi="Wingdings" w:hint="default"/>
+        <w:sz w:val="20"/>
+      </w:rPr>
+    </w:lvl>
+    <w:lvl w:ilvl="7" w:tentative="1">
+      <w:start w:val="1"/>
+      <w:numFmt w:val="bullet"/>
+      <w:lvlText w:val=""/>
+      <w:lvlJc w:val="left"/>
+      <w:pPr>
+        <w:tabs>
+          <w:tab w:val="num" w:pos="5760"/>
+        </w:tabs>
+        <w:ind w:left="5760" w:hanging="360"/>
+      </w:pPr>
+      <w:rPr>
+        <w:rFonts w:ascii="Wingdings" w:hAnsi="Wingdings" w:hint="default"/>
+        <w:sz w:val="20"/>
+      </w:rPr>
+    </w:lvl>
+    <w:lvl w:ilvl="8" w:tentative="1">
+      <w:start w:val="1"/>
+      <w:numFmt w:val="bullet"/>
+      <w:lvlText w:val=""/>
+      <w:lvlJc w:val="left"/>
+      <w:pPr>
+        <w:tabs>
+          <w:tab w:val="num" w:pos="6480"/>
+        </w:tabs>
+        <w:ind w:left="6480" w:hanging="360"/>
+      </w:pPr>
+      <w:rPr>
+        <w:rFonts w:ascii="Wingdings" w:hAnsi="Wingdings" w:hint="default"/>
+        <w:sz w:val="20"/>
+      </w:rPr>
+    </w:lvl>
+  </w:abstractNum>
+  <w:abstractNum w:abstractNumId="4" w15:restartNumberingAfterBreak="0">
     <w:nsid w:val="1BE25D8B"/>
     <w:multiLevelType w:val="multilevel"/>
     <w:tmpl w:val="DFF078B4"/>
@@ -3472,7 +2830,156 @@
       </w:rPr>
     </w:lvl>
   </w:abstractNum>
-  <w:abstractNum w:abstractNumId="3" w15:restartNumberingAfterBreak="0">
+  <w:abstractNum w:abstractNumId="5" w15:restartNumberingAfterBreak="0">
+    <w:nsid w:val="31903027"/>
+    <w:multiLevelType w:val="multilevel"/>
+    <w:tmpl w:val="004A6EC6"/>
+    <w:lvl w:ilvl="0">
+      <w:start w:val="1"/>
+      <w:numFmt w:val="bullet"/>
+      <w:lvlText w:val=""/>
+      <w:lvlJc w:val="left"/>
+      <w:pPr>
+        <w:tabs>
+          <w:tab w:val="num" w:pos="720"/>
+        </w:tabs>
+        <w:ind w:left="720" w:hanging="360"/>
+      </w:pPr>
+      <w:rPr>
+        <w:rFonts w:ascii="Symbol" w:hAnsi="Symbol" w:hint="default"/>
+        <w:sz w:val="20"/>
+      </w:rPr>
+    </w:lvl>
+    <w:lvl w:ilvl="1" w:tentative="1">
+      <w:start w:val="1"/>
+      <w:numFmt w:val="bullet"/>
+      <w:lvlText w:val="o"/>
+      <w:lvlJc w:val="left"/>
+      <w:pPr>
+        <w:tabs>
+          <w:tab w:val="num" w:pos="1440"/>
+        </w:tabs>
+        <w:ind w:left="1440" w:hanging="360"/>
+      </w:pPr>
+      <w:rPr>
+        <w:rFonts w:ascii="Courier New" w:hAnsi="Courier New" w:hint="default"/>
+        <w:sz w:val="20"/>
+      </w:rPr>
+    </w:lvl>
+    <w:lvl w:ilvl="2" w:tentative="1">
+      <w:start w:val="1"/>
+      <w:numFmt w:val="bullet"/>
+      <w:lvlText w:val=""/>
+      <w:lvlJc w:val="left"/>
+      <w:pPr>
+        <w:tabs>
+          <w:tab w:val="num" w:pos="2160"/>
+        </w:tabs>
+        <w:ind w:left="2160" w:hanging="360"/>
+      </w:pPr>
+      <w:rPr>
+        <w:rFonts w:ascii="Wingdings" w:hAnsi="Wingdings" w:hint="default"/>
+        <w:sz w:val="20"/>
+      </w:rPr>
+    </w:lvl>
+    <w:lvl w:ilvl="3" w:tentative="1">
+      <w:start w:val="1"/>
+      <w:numFmt w:val="bullet"/>
+      <w:lvlText w:val=""/>
+      <w:lvlJc w:val="left"/>
+      <w:pPr>
+        <w:tabs>
+          <w:tab w:val="num" w:pos="2880"/>
+        </w:tabs>
+        <w:ind w:left="2880" w:hanging="360"/>
+      </w:pPr>
+      <w:rPr>
+        <w:rFonts w:ascii="Wingdings" w:hAnsi="Wingdings" w:hint="default"/>
+        <w:sz w:val="20"/>
+      </w:rPr>
+    </w:lvl>
+    <w:lvl w:ilvl="4" w:tentative="1">
+      <w:start w:val="1"/>
+      <w:numFmt w:val="bullet"/>
+      <w:lvlText w:val=""/>
+      <w:lvlJc w:val="left"/>
+      <w:pPr>
+        <w:tabs>
+          <w:tab w:val="num" w:pos="3600"/>
+        </w:tabs>
+        <w:ind w:left="3600" w:hanging="360"/>
+      </w:pPr>
+      <w:rPr>
+        <w:rFonts w:ascii="Wingdings" w:hAnsi="Wingdings" w:hint="default"/>
+        <w:sz w:val="20"/>
+      </w:rPr>
+    </w:lvl>
+    <w:lvl w:ilvl="5" w:tentative="1">
+      <w:start w:val="1"/>
+      <w:numFmt w:val="bullet"/>
+      <w:lvlText w:val=""/>
+      <w:lvlJc w:val="left"/>
+      <w:pPr>
+        <w:tabs>
+          <w:tab w:val="num" w:pos="4320"/>
+        </w:tabs>
+        <w:ind w:left="4320" w:hanging="360"/>
+      </w:pPr>
+      <w:rPr>
+        <w:rFonts w:ascii="Wingdings" w:hAnsi="Wingdings" w:hint="default"/>
+        <w:sz w:val="20"/>
+      </w:rPr>
+    </w:lvl>
+    <w:lvl w:ilvl="6" w:tentative="1">
+      <w:start w:val="1"/>
+      <w:numFmt w:val="bullet"/>
+      <w:lvlText w:val=""/>
+      <w:lvlJc w:val="left"/>
+      <w:pPr>
+        <w:tabs>
+          <w:tab w:val="num" w:pos="5040"/>
+        </w:tabs>
+        <w:ind w:left="5040" w:hanging="360"/>
+      </w:pPr>
+      <w:rPr>
+        <w:rFonts w:ascii="Wingdings" w:hAnsi="Wingdings" w:hint="default"/>
+        <w:sz w:val="20"/>
+      </w:rPr>
+    </w:lvl>
+    <w:lvl w:ilvl="7" w:tentative="1">
+      <w:start w:val="1"/>
+      <w:numFmt w:val="bullet"/>
+      <w:lvlText w:val=""/>
+      <w:lvlJc w:val="left"/>
+      <w:pPr>
+        <w:tabs>
+          <w:tab w:val="num" w:pos="5760"/>
+        </w:tabs>
+        <w:ind w:left="5760" w:hanging="360"/>
+      </w:pPr>
+      <w:rPr>
+        <w:rFonts w:ascii="Wingdings" w:hAnsi="Wingdings" w:hint="default"/>
+        <w:sz w:val="20"/>
+      </w:rPr>
+    </w:lvl>
+    <w:lvl w:ilvl="8" w:tentative="1">
+      <w:start w:val="1"/>
+      <w:numFmt w:val="bullet"/>
+      <w:lvlText w:val=""/>
+      <w:lvlJc w:val="left"/>
+      <w:pPr>
+        <w:tabs>
+          <w:tab w:val="num" w:pos="6480"/>
+        </w:tabs>
+        <w:ind w:left="6480" w:hanging="360"/>
+      </w:pPr>
+      <w:rPr>
+        <w:rFonts w:ascii="Wingdings" w:hAnsi="Wingdings" w:hint="default"/>
+        <w:sz w:val="20"/>
+      </w:rPr>
+    </w:lvl>
+  </w:abstractNum>
+  <w:abstractNum w:abstractNumId="6" w15:restartNumberingAfterBreak="0">
     <w:nsid w:val="346F5066"/>
     <w:multiLevelType w:val="multilevel"/>
     <w:tmpl w:val="445C00E0"/>
@@ -3621,7 +3128,305 @@
       </w:rPr>
     </w:lvl>
   </w:abstractNum>
-  <w:abstractNum w:abstractNumId="4" w15:restartNumberingAfterBreak="0">
+  <w:abstractNum w:abstractNumId="7" w15:restartNumberingAfterBreak="0">
+    <w:nsid w:val="3D8A1095"/>
+    <w:multiLevelType w:val="multilevel"/>
+    <w:tmpl w:val="CE44B90E"/>
+    <w:lvl w:ilvl="0">
+      <w:start w:val="1"/>
+      <w:numFmt w:val="bullet"/>
+      <w:lvlText w:val=""/>
+      <w:lvlJc w:val="left"/>
+      <w:pPr>
+        <w:tabs>
+          <w:tab w:val="num" w:pos="720"/>
+        </w:tabs>
+        <w:ind w:left="720" w:hanging="360"/>
+      </w:pPr>
+      <w:rPr>
+        <w:rFonts w:ascii="Symbol" w:hAnsi="Symbol" w:hint="default"/>
+        <w:sz w:val="20"/>
+      </w:rPr>
+    </w:lvl>
+    <w:lvl w:ilvl="1" w:tentative="1">
+      <w:start w:val="1"/>
+      <w:numFmt w:val="bullet"/>
+      <w:lvlText w:val="o"/>
+      <w:lvlJc w:val="left"/>
+      <w:pPr>
+        <w:tabs>
+          <w:tab w:val="num" w:pos="1440"/>
+        </w:tabs>
+        <w:ind w:left="1440" w:hanging="360"/>
+      </w:pPr>
+      <w:rPr>
+        <w:rFonts w:ascii="Courier New" w:hAnsi="Courier New" w:hint="default"/>
+        <w:sz w:val="20"/>
+      </w:rPr>
+    </w:lvl>
+    <w:lvl w:ilvl="2" w:tentative="1">
+      <w:start w:val="1"/>
+      <w:numFmt w:val="bullet"/>
+      <w:lvlText w:val=""/>
+      <w:lvlJc w:val="left"/>
+      <w:pPr>
+        <w:tabs>
+          <w:tab w:val="num" w:pos="2160"/>
+        </w:tabs>
+        <w:ind w:left="2160" w:hanging="360"/>
+      </w:pPr>
+      <w:rPr>
+        <w:rFonts w:ascii="Wingdings" w:hAnsi="Wingdings" w:hint="default"/>
+        <w:sz w:val="20"/>
+      </w:rPr>
+    </w:lvl>
+    <w:lvl w:ilvl="3" w:tentative="1">
+      <w:start w:val="1"/>
+      <w:numFmt w:val="bullet"/>
+      <w:lvlText w:val=""/>
+      <w:lvlJc w:val="left"/>
+      <w:pPr>
+        <w:tabs>
+          <w:tab w:val="num" w:pos="2880"/>
+        </w:tabs>
+        <w:ind w:left="2880" w:hanging="360"/>
+      </w:pPr>
+      <w:rPr>
+        <w:rFonts w:ascii="Wingdings" w:hAnsi="Wingdings" w:hint="default"/>
+        <w:sz w:val="20"/>
+      </w:rPr>
+    </w:lvl>
+    <w:lvl w:ilvl="4" w:tentative="1">
+      <w:start w:val="1"/>
+      <w:numFmt w:val="bullet"/>
+      <w:lvlText w:val=""/>
+      <w:lvlJc w:val="left"/>
+      <w:pPr>
+        <w:tabs>
+          <w:tab w:val="num" w:pos="3600"/>
+        </w:tabs>
+        <w:ind w:left="3600" w:hanging="360"/>
+      </w:pPr>
+      <w:rPr>
+        <w:rFonts w:ascii="Wingdings" w:hAnsi="Wingdings" w:hint="default"/>
+        <w:sz w:val="20"/>
+      </w:rPr>
+    </w:lvl>
+    <w:lvl w:ilvl="5" w:tentative="1">
+      <w:start w:val="1"/>
+      <w:numFmt w:val="bullet"/>
+      <w:lvlText w:val=""/>
+      <w:lvlJc w:val="left"/>
+      <w:pPr>
+        <w:tabs>
+          <w:tab w:val="num" w:pos="4320"/>
+        </w:tabs>
+        <w:ind w:left="4320" w:hanging="360"/>
+      </w:pPr>
+      <w:rPr>
+        <w:rFonts w:ascii="Wingdings" w:hAnsi="Wingdings" w:hint="default"/>
+        <w:sz w:val="20"/>
+      </w:rPr>
+    </w:lvl>
+    <w:lvl w:ilvl="6" w:tentative="1">
+      <w:start w:val="1"/>
+      <w:numFmt w:val="bullet"/>
+      <w:lvlText w:val=""/>
+      <w:lvlJc w:val="left"/>
+      <w:pPr>
+        <w:tabs>
+          <w:tab w:val="num" w:pos="5040"/>
+        </w:tabs>
+        <w:ind w:left="5040" w:hanging="360"/>
+      </w:pPr>
+      <w:rPr>
+        <w:rFonts w:ascii="Wingdings" w:hAnsi="Wingdings" w:hint="default"/>
+        <w:sz w:val="20"/>
+      </w:rPr>
+    </w:lvl>
+    <w:lvl w:ilvl="7" w:tentative="1">
+      <w:start w:val="1"/>
+      <w:numFmt w:val="bullet"/>
+      <w:lvlText w:val=""/>
+      <w:lvlJc w:val="left"/>
+      <w:pPr>
+        <w:tabs>
+          <w:tab w:val="num" w:pos="5760"/>
+        </w:tabs>
+        <w:ind w:left="5760" w:hanging="360"/>
+      </w:pPr>
+      <w:rPr>
+        <w:rFonts w:ascii="Wingdings" w:hAnsi="Wingdings" w:hint="default"/>
+        <w:sz w:val="20"/>
+      </w:rPr>
+    </w:lvl>
+    <w:lvl w:ilvl="8" w:tentative="1">
+      <w:start w:val="1"/>
+      <w:numFmt w:val="bullet"/>
+      <w:lvlText w:val=""/>
+      <w:lvlJc w:val="left"/>
+      <w:pPr>
+        <w:tabs>
+          <w:tab w:val="num" w:pos="6480"/>
+        </w:tabs>
+        <w:ind w:left="6480" w:hanging="360"/>
+      </w:pPr>
+      <w:rPr>
+        <w:rFonts w:ascii="Wingdings" w:hAnsi="Wingdings" w:hint="default"/>
+        <w:sz w:val="20"/>
+      </w:rPr>
+    </w:lvl>
+  </w:abstractNum>
+  <w:abstractNum w:abstractNumId="8" w15:restartNumberingAfterBreak="0">
+    <w:nsid w:val="3F9C78BC"/>
+    <w:multiLevelType w:val="multilevel"/>
+    <w:tmpl w:val="0F6050A4"/>
+    <w:lvl w:ilvl="0">
+      <w:start w:val="1"/>
+      <w:numFmt w:val="bullet"/>
+      <w:lvlText w:val=""/>
+      <w:lvlJc w:val="left"/>
+      <w:pPr>
+        <w:tabs>
+          <w:tab w:val="num" w:pos="720"/>
+        </w:tabs>
+        <w:ind w:left="720" w:hanging="360"/>
+      </w:pPr>
+      <w:rPr>
+        <w:rFonts w:ascii="Symbol" w:hAnsi="Symbol" w:hint="default"/>
+        <w:sz w:val="20"/>
+      </w:rPr>
+    </w:lvl>
+    <w:lvl w:ilvl="1" w:tentative="1">
+      <w:start w:val="1"/>
+      <w:numFmt w:val="bullet"/>
+      <w:lvlText w:val="o"/>
+      <w:lvlJc w:val="left"/>
+      <w:pPr>
+        <w:tabs>
+          <w:tab w:val="num" w:pos="1440"/>
+        </w:tabs>
+        <w:ind w:left="1440" w:hanging="360"/>
+      </w:pPr>
+      <w:rPr>
+        <w:rFonts w:ascii="Courier New" w:hAnsi="Courier New" w:hint="default"/>
+        <w:sz w:val="20"/>
+      </w:rPr>
+    </w:lvl>
+    <w:lvl w:ilvl="2" w:tentative="1">
+      <w:start w:val="1"/>
+      <w:numFmt w:val="bullet"/>
+      <w:lvlText w:val=""/>
+      <w:lvlJc w:val="left"/>
+      <w:pPr>
+        <w:tabs>
+          <w:tab w:val="num" w:pos="2160"/>
+        </w:tabs>
+        <w:ind w:left="2160" w:hanging="360"/>
+      </w:pPr>
+      <w:rPr>
+        <w:rFonts w:ascii="Wingdings" w:hAnsi="Wingdings" w:hint="default"/>
+        <w:sz w:val="20"/>
+      </w:rPr>
+    </w:lvl>
+    <w:lvl w:ilvl="3" w:tentative="1">
+      <w:start w:val="1"/>
+      <w:numFmt w:val="bullet"/>
+      <w:lvlText w:val=""/>
+      <w:lvlJc w:val="left"/>
+      <w:pPr>
+        <w:tabs>
+          <w:tab w:val="num" w:pos="2880"/>
+        </w:tabs>
+        <w:ind w:left="2880" w:hanging="360"/>
+      </w:pPr>
+      <w:rPr>
+        <w:rFonts w:ascii="Wingdings" w:hAnsi="Wingdings" w:hint="default"/>
+        <w:sz w:val="20"/>
+      </w:rPr>
+    </w:lvl>
+    <w:lvl w:ilvl="4" w:tentative="1">
+      <w:start w:val="1"/>
+      <w:numFmt w:val="bullet"/>
+      <w:lvlText w:val=""/>
+      <w:lvlJc w:val="left"/>
+      <w:pPr>
+        <w:tabs>
+          <w:tab w:val="num" w:pos="3600"/>
+        </w:tabs>
+        <w:ind w:left="3600" w:hanging="360"/>
+      </w:pPr>
+      <w:rPr>
+        <w:rFonts w:ascii="Wingdings" w:hAnsi="Wingdings" w:hint="default"/>
+        <w:sz w:val="20"/>
+      </w:rPr>
+    </w:lvl>
+    <w:lvl w:ilvl="5" w:tentative="1">
+      <w:start w:val="1"/>
+      <w:numFmt w:val="bullet"/>
+      <w:lvlText w:val=""/>
+      <w:lvlJc w:val="left"/>
+      <w:pPr>
+        <w:tabs>
+          <w:tab w:val="num" w:pos="4320"/>
+        </w:tabs>
+        <w:ind w:left="4320" w:hanging="360"/>
+      </w:pPr>
+      <w:rPr>
+        <w:rFonts w:ascii="Wingdings" w:hAnsi="Wingdings" w:hint="default"/>
+        <w:sz w:val="20"/>
+      </w:rPr>
+    </w:lvl>
+    <w:lvl w:ilvl="6" w:tentative="1">
+      <w:start w:val="1"/>
+      <w:numFmt w:val="bullet"/>
+      <w:lvlText w:val=""/>
+      <w:lvlJc w:val="left"/>
+      <w:pPr>
+        <w:tabs>
+          <w:tab w:val="num" w:pos="5040"/>
+        </w:tabs>
+        <w:ind w:left="5040" w:hanging="360"/>
+      </w:pPr>
+      <w:rPr>
+        <w:rFonts w:ascii="Wingdings" w:hAnsi="Wingdings" w:hint="default"/>
+        <w:sz w:val="20"/>
+      </w:rPr>
+    </w:lvl>
+    <w:lvl w:ilvl="7" w:tentative="1">
+      <w:start w:val="1"/>
+      <w:numFmt w:val="bullet"/>
+      <w:lvlText w:val=""/>
+      <w:lvlJc w:val="left"/>
+      <w:pPr>
+        <w:tabs>
+          <w:tab w:val="num" w:pos="5760"/>
+        </w:tabs>
+        <w:ind w:left="5760" w:hanging="360"/>
+      </w:pPr>
+      <w:rPr>
+        <w:rFonts w:ascii="Wingdings" w:hAnsi="Wingdings" w:hint="default"/>
+        <w:sz w:val="20"/>
+      </w:rPr>
+    </w:lvl>
+    <w:lvl w:ilvl="8" w:tentative="1">
+      <w:start w:val="1"/>
+      <w:numFmt w:val="bullet"/>
+      <w:lvlText w:val=""/>
+      <w:lvlJc w:val="left"/>
+      <w:pPr>
+        <w:tabs>
+          <w:tab w:val="num" w:pos="6480"/>
+        </w:tabs>
+        <w:ind w:left="6480" w:hanging="360"/>
+      </w:pPr>
+      <w:rPr>
+        <w:rFonts w:ascii="Wingdings" w:hAnsi="Wingdings" w:hint="default"/>
+        <w:sz w:val="20"/>
+      </w:rPr>
+    </w:lvl>
+  </w:abstractNum>
+  <w:abstractNum w:abstractNumId="9" w15:restartNumberingAfterBreak="0">
     <w:nsid w:val="5CD35EAA"/>
     <w:multiLevelType w:val="multilevel"/>
     <w:tmpl w:val="EF38E37A"/>
@@ -3770,7 +3575,156 @@
       </w:rPr>
     </w:lvl>
   </w:abstractNum>
-  <w:abstractNum w:abstractNumId="5" w15:restartNumberingAfterBreak="0">
+  <w:abstractNum w:abstractNumId="10" w15:restartNumberingAfterBreak="0">
+    <w:nsid w:val="6C246CB3"/>
+    <w:multiLevelType w:val="multilevel"/>
+    <w:tmpl w:val="9F0ADABC"/>
+    <w:lvl w:ilvl="0">
+      <w:start w:val="1"/>
+      <w:numFmt w:val="bullet"/>
+      <w:lvlText w:val=""/>
+      <w:lvlJc w:val="left"/>
+      <w:pPr>
+        <w:tabs>
+          <w:tab w:val="num" w:pos="720"/>
+        </w:tabs>
+        <w:ind w:left="720" w:hanging="360"/>
+      </w:pPr>
+      <w:rPr>
+        <w:rFonts w:ascii="Symbol" w:hAnsi="Symbol" w:hint="default"/>
+        <w:sz w:val="20"/>
+      </w:rPr>
+    </w:lvl>
+    <w:lvl w:ilvl="1" w:tentative="1">
+      <w:start w:val="1"/>
+      <w:numFmt w:val="bullet"/>
+      <w:lvlText w:val="o"/>
+      <w:lvlJc w:val="left"/>
+      <w:pPr>
+        <w:tabs>
+          <w:tab w:val="num" w:pos="1440"/>
+        </w:tabs>
+        <w:ind w:left="1440" w:hanging="360"/>
+      </w:pPr>
+      <w:rPr>
+        <w:rFonts w:ascii="Courier New" w:hAnsi="Courier New" w:hint="default"/>
+        <w:sz w:val="20"/>
+      </w:rPr>
+    </w:lvl>
+    <w:lvl w:ilvl="2" w:tentative="1">
+      <w:start w:val="1"/>
+      <w:numFmt w:val="bullet"/>
+      <w:lvlText w:val=""/>
+      <w:lvlJc w:val="left"/>
+      <w:pPr>
+        <w:tabs>
+          <w:tab w:val="num" w:pos="2160"/>
+        </w:tabs>
+        <w:ind w:left="2160" w:hanging="360"/>
+      </w:pPr>
+      <w:rPr>
+        <w:rFonts w:ascii="Wingdings" w:hAnsi="Wingdings" w:hint="default"/>
+        <w:sz w:val="20"/>
+      </w:rPr>
+    </w:lvl>
+    <w:lvl w:ilvl="3" w:tentative="1">
+      <w:start w:val="1"/>
+      <w:numFmt w:val="bullet"/>
+      <w:lvlText w:val=""/>
+      <w:lvlJc w:val="left"/>
+      <w:pPr>
+        <w:tabs>
+          <w:tab w:val="num" w:pos="2880"/>
+        </w:tabs>
+        <w:ind w:left="2880" w:hanging="360"/>
+      </w:pPr>
+      <w:rPr>
+        <w:rFonts w:ascii="Wingdings" w:hAnsi="Wingdings" w:hint="default"/>
+        <w:sz w:val="20"/>
+      </w:rPr>
+    </w:lvl>
+    <w:lvl w:ilvl="4" w:tentative="1">
+      <w:start w:val="1"/>
+      <w:numFmt w:val="bullet"/>
+      <w:lvlText w:val=""/>
+      <w:lvlJc w:val="left"/>
+      <w:pPr>
+        <w:tabs>
+          <w:tab w:val="num" w:pos="3600"/>
+        </w:tabs>
+        <w:ind w:left="3600" w:hanging="360"/>
+      </w:pPr>
+      <w:rPr>
+        <w:rFonts w:ascii="Wingdings" w:hAnsi="Wingdings" w:hint="default"/>
+        <w:sz w:val="20"/>
+      </w:rPr>
+    </w:lvl>
+    <w:lvl w:ilvl="5" w:tentative="1">
+      <w:start w:val="1"/>
+      <w:numFmt w:val="bullet"/>
+      <w:lvlText w:val=""/>
+      <w:lvlJc w:val="left"/>
+      <w:pPr>
+        <w:tabs>
+          <w:tab w:val="num" w:pos="4320"/>
+        </w:tabs>
+        <w:ind w:left="4320" w:hanging="360"/>
+      </w:pPr>
+      <w:rPr>
+        <w:rFonts w:ascii="Wingdings" w:hAnsi="Wingdings" w:hint="default"/>
+        <w:sz w:val="20"/>
+      </w:rPr>
+    </w:lvl>
+    <w:lvl w:ilvl="6" w:tentative="1">
+      <w:start w:val="1"/>
+      <w:numFmt w:val="bullet"/>
+      <w:lvlText w:val=""/>
+      <w:lvlJc w:val="left"/>
+      <w:pPr>
+        <w:tabs>
+          <w:tab w:val="num" w:pos="5040"/>
+        </w:tabs>
+        <w:ind w:left="5040" w:hanging="360"/>
+      </w:pPr>
+      <w:rPr>
+        <w:rFonts w:ascii="Wingdings" w:hAnsi="Wingdings" w:hint="default"/>
+        <w:sz w:val="20"/>
+      </w:rPr>
+    </w:lvl>
+    <w:lvl w:ilvl="7" w:tentative="1">
+      <w:start w:val="1"/>
+      <w:numFmt w:val="bullet"/>
+      <w:lvlText w:val=""/>
+      <w:lvlJc w:val="left"/>
+      <w:pPr>
+        <w:tabs>
+          <w:tab w:val="num" w:pos="5760"/>
+        </w:tabs>
+        <w:ind w:left="5760" w:hanging="360"/>
+      </w:pPr>
+      <w:rPr>
+        <w:rFonts w:ascii="Wingdings" w:hAnsi="Wingdings" w:hint="default"/>
+        <w:sz w:val="20"/>
+      </w:rPr>
+    </w:lvl>
+    <w:lvl w:ilvl="8" w:tentative="1">
+      <w:start w:val="1"/>
+      <w:numFmt w:val="bullet"/>
+      <w:lvlText w:val=""/>
+      <w:lvlJc w:val="left"/>
+      <w:pPr>
+        <w:tabs>
+          <w:tab w:val="num" w:pos="6480"/>
+        </w:tabs>
+        <w:ind w:left="6480" w:hanging="360"/>
+      </w:pPr>
+      <w:rPr>
+        <w:rFonts w:ascii="Wingdings" w:hAnsi="Wingdings" w:hint="default"/>
+        <w:sz w:val="20"/>
+      </w:rPr>
+    </w:lvl>
+  </w:abstractNum>
+  <w:abstractNum w:abstractNumId="11" w15:restartNumberingAfterBreak="0">
     <w:nsid w:val="6EFF6F43"/>
     <w:multiLevelType w:val="multilevel"/>
     <w:tmpl w:val="55DE8E04"/>
@@ -3919,7 +3873,7 @@
       </w:rPr>
     </w:lvl>
   </w:abstractNum>
-  <w:abstractNum w:abstractNumId="6" w15:restartNumberingAfterBreak="0">
+  <w:abstractNum w:abstractNumId="12" w15:restartNumberingAfterBreak="0">
     <w:nsid w:val="796156DF"/>
     <w:multiLevelType w:val="multilevel"/>
     <w:tmpl w:val="DC6CBCC8"/>
@@ -4069,25 +4023,43 @@
     </w:lvl>
   </w:abstractNum>
   <w:num w:numId="1" w16cid:durableId="1806041694">
-    <w:abstractNumId w:val="6"/>
+    <w:abstractNumId w:val="12"/>
   </w:num>
   <w:num w:numId="2" w16cid:durableId="1707098713">
-    <w:abstractNumId w:val="5"/>
+    <w:abstractNumId w:val="11"/>
   </w:num>
   <w:num w:numId="3" w16cid:durableId="901211168">
     <w:abstractNumId w:val="0"/>
   </w:num>
   <w:num w:numId="4" w16cid:durableId="1919752417">
+    <w:abstractNumId w:val="6"/>
+  </w:num>
+  <w:num w:numId="5" w16cid:durableId="209613294">
+    <w:abstractNumId w:val="4"/>
+  </w:num>
+  <w:num w:numId="6" w16cid:durableId="1496652126">
+    <w:abstractNumId w:val="2"/>
+  </w:num>
+  <w:num w:numId="7" w16cid:durableId="613027289">
+    <w:abstractNumId w:val="9"/>
+  </w:num>
+  <w:num w:numId="8" w16cid:durableId="1799836646">
+    <w:abstractNumId w:val="1"/>
+  </w:num>
+  <w:num w:numId="9" w16cid:durableId="2045015949">
+    <w:abstractNumId w:val="10"/>
+  </w:num>
+  <w:num w:numId="10" w16cid:durableId="2050102723">
+    <w:abstractNumId w:val="7"/>
+  </w:num>
+  <w:num w:numId="11" w16cid:durableId="358899302">
     <w:abstractNumId w:val="3"/>
   </w:num>
-  <w:num w:numId="5" w16cid:durableId="209613294">
-    <w:abstractNumId w:val="2"/>
+  <w:num w:numId="12" w16cid:durableId="538276489">
+    <w:abstractNumId w:val="5"/>
   </w:num>
-  <w:num w:numId="6" w16cid:durableId="1496652126">
-    <w:abstractNumId w:val="1"/>
-  </w:num>
-  <w:num w:numId="7" w16cid:durableId="613027289">
-    <w:abstractNumId w:val="4"/>
+  <w:num w:numId="13" w16cid:durableId="219246384">
+    <w:abstractNumId w:val="8"/>
   </w:num>
 </w:numbering>
 </file>

</xml_diff>